<commit_message>
docs: rewrite SKYNET deck (SKYNET serves agents) + cover proxy/discovery-probe/servers
Reframe SKYNET correctly: it is the internal AI that SERVES the agents
(the `ai_mode=real` ai-backend brain driving the Lane B decide->act
loop), not a thing to govern. New deck covers what the prior one missed:
- agent specificities (2 orthogonal axes, 3 forms, git vs MAF families)
- server properties (registry, 3 modes mock_local/declared_url/real_saas,
  honeypot, wire contract, deterministic doubles, access log)
- proxy (ProxyTrace request+response, wire overlay, fail-safe I5)
- discovery Rust probe (discoveryprobe eBPF+aya, kernel tracepoints,
  CAP_BPF broker, replay vs live, conformance vs the team's real tool)
- identification 4 dimensions
8 rendered Mermaid diagrams incl. a corrected SKYNET-serves-agents figure
and a discoveryprobe eBPF figure.

ARCHITECTURE.md: identification corpus 10->11 agents (add the missing
ghost-unmediated-writer row, verified in corpus ground-truth, R13).
</commit_message>
<xml_diff>
--- a/inspect_ia_agents-presentation-SKYNET.docx
+++ b/inspect_ia_agents-presentation-SKYNET.docx
@@ -4,7 +4,7 @@
   <w:body>
     <w:p>
       <w:pPr>
-        <w:spacing w:after="100" w:before="1800"/>
+        <w:spacing w:after="100" w:before="1700"/>
         <w:jc w:val="center"/>
       </w:pPr>
       <w:r>
@@ -29,12 +29,12 @@
           <w:sz w:val="30"/>
           <w:szCs w:val="30"/>
         </w:rPr>
-        <w:t xml:space="preserve">Gouverner, observer et rejouer les agents IA</w:t>
-      </w:r>
-    </w:p>
-    <w:p>
-      <w:pPr>
-        <w:spacing w:after="400"/>
+        <w:t xml:space="preserve">Le banc qui fait tourner et recette les agents IA</w:t>
+      </w:r>
+    </w:p>
+    <w:p>
+      <w:pPr>
+        <w:spacing w:after="380"/>
         <w:jc w:val="center"/>
       </w:pPr>
       <w:r>
@@ -45,7 +45,7 @@
           <w:sz w:val="24"/>
           <w:szCs w:val="24"/>
         </w:rPr>
-        <w:t xml:space="preserve">Connexion de SKYNET (IA interne) a la couche de gouvernance</w:t>
+        <w:t xml:space="preserve">Connecter SKYNET, notre IA interne, comme cerveau des agents</w:t>
       </w:r>
     </w:p>
     <w:p>
@@ -124,19 +124,85 @@
         <w:spacing w:after="120"/>
       </w:pPr>
       <w:r>
-        <w:t xml:space="preserve">Les agents IA agissent sur des systemes reels (git, identite, finance, cloud) via des echanges reseau que, aujourd'hui, personne n'observe ni ne controle. inspect_ia_agents rend ces echanges lisibles, demontre qu'on peut les influencer (red-team), et prouve qu'un controle deterministe -- identite verifiee apres decouverte, regles d'activite versionnees -- est la seule reponse auditable.</w:t>
-      </w:r>
-    </w:p>
-    <w:p>
-      <w:pPr>
-        <w:spacing w:after="120"/>
-      </w:pPr>
+        <w:t xml:space="preserve">inspect_ia_agents est un </w:t>
+      </w:r>
       <w:r>
         <w:rPr>
           <w:b/>
           <w:bCs/>
         </w:rPr>
-        <w:t xml:space="preserve">Objectif de cette presentation : montrer comment brancher notre IA interne SKYNET sur cette couche de gouvernance, pour qu'aucune action de SKYNET sur un systeme tiers ne s'execute sans etre evaluee, tracee et rejouable.</w:t>
+        <w:t xml:space="preserve">banc de recette</w:t>
+      </w:r>
+      <w:r>
+        <w:t xml:space="preserve"> : il fait vivre des agents IA, rend leur comportement </w:t>
+      </w:r>
+      <w:r>
+        <w:rPr>
+          <w:b/>
+          <w:bCs/>
+        </w:rPr>
+        <w:t xml:space="preserve">observable</w:t>
+      </w:r>
+      <w:r>
+        <w:t xml:space="preserve"> (proxy + sonde noyau), et mesure si les outils de </w:t>
+      </w:r>
+      <w:r>
+        <w:rPr>
+          <w:b/>
+          <w:bCs/>
+        </w:rPr>
+        <w:t xml:space="preserve">discovery</w:t>
+      </w:r>
+      <w:r>
+        <w:t xml:space="preserve"> (reperer un agent) et d'</w:t>
+      </w:r>
+      <w:r>
+        <w:rPr>
+          <w:b/>
+          <w:bCs/>
+        </w:rPr>
+        <w:t xml:space="preserve">identification</w:t>
+      </w:r>
+      <w:r>
+        <w:t xml:space="preserve"> (juger un agent sur 4 dimensions) donnent la bonne reponse.</w:t>
+      </w:r>
+    </w:p>
+    <w:p>
+      <w:pPr>
+        <w:spacing w:after="120"/>
+      </w:pPr>
+      <w:r>
+        <w:t xml:space="preserve">SKYNET est </w:t>
+      </w:r>
+      <w:r>
+        <w:rPr>
+          <w:b/>
+          <w:bCs/>
+        </w:rPr>
+        <w:t xml:space="preserve">notre IA interne</w:t>
+      </w:r>
+      <w:r>
+        <w:t xml:space="preserve"> : c'est elle qui </w:t>
+      </w:r>
+      <w:r>
+        <w:rPr>
+          <w:b/>
+          <w:bCs/>
+        </w:rPr>
+        <w:t xml:space="preserve">sert le cerveau des agents</w:t>
+      </w:r>
+      <w:r>
+        <w:t xml:space="preserve"> -- l'agent lui demande, a chaque etape, quelle action faire. La brancher revient a la declarer comme </w:t>
+      </w:r>
+      <w:r>
+        <w:rPr>
+          <w:b/>
+          <w:bCs/>
+        </w:rPr>
+        <w:t xml:space="preserve">ai-backend</w:t>
+      </w:r>
+      <w:r>
+        <w:t xml:space="preserve"> du banc : les agents tournent alors pour de vrai sous SKYNET, et le banc les capte, les decouvre et les juge.</w:t>
       </w:r>
     </w:p>
     <w:p>
@@ -160,8 +226,8 @@
         </w:tblBorders>
       </w:tblPr>
       <w:tblGrid>
-        <w:gridCol w:w="4680"/>
-        <w:gridCol w:w="4680"/>
+        <w:gridCol w:w="5400"/>
+        <w:gridCol w:w="3960"/>
       </w:tblGrid>
       <w:tr>
         <w:trPr>
@@ -169,7 +235,7 @@
         </w:trPr>
         <w:tc>
           <w:tcPr>
-            <w:tcW w:type="dxa" w:w="4680"/>
+            <w:tcW w:type="dxa" w:w="5400"/>
             <w:tcBorders>
               <w:top w:val="single" w:color="BBBBBB" w:sz="1"/>
               <w:left w:val="single" w:color="BBBBBB" w:sz="1"/>
@@ -199,7 +265,7 @@
         </w:tc>
         <w:tc>
           <w:tcPr>
-            <w:tcW w:type="dxa" w:w="4680"/>
+            <w:tcW w:type="dxa" w:w="3960"/>
             <w:tcBorders>
               <w:top w:val="single" w:color="BBBBBB" w:sz="1"/>
               <w:left w:val="single" w:color="BBBBBB" w:sz="1"/>
@@ -231,7 +297,7 @@
       <w:tr>
         <w:tc>
           <w:tcPr>
-            <w:tcW w:type="dxa" w:w="4680"/>
+            <w:tcW w:type="dxa" w:w="5400"/>
             <w:tcBorders>
               <w:top w:val="single" w:color="BBBBBB" w:sz="1"/>
               <w:left w:val="single" w:color="BBBBBB" w:sz="1"/>
@@ -248,13 +314,13 @@
           </w:tcPr>
           <w:p>
             <w:r>
-              <w:t xml:space="preserve">Actions gouvernees (catalogue)</w:t>
-            </w:r>
-          </w:p>
-        </w:tc>
-        <w:tc>
-          <w:tcPr>
-            <w:tcW w:type="dxa" w:w="4680"/>
+              <w:t xml:space="preserve">Catalogue d'actions executables</w:t>
+            </w:r>
+          </w:p>
+        </w:tc>
+        <w:tc>
+          <w:tcPr>
+            <w:tcW w:type="dxa" w:w="3960"/>
             <w:tcBorders>
               <w:top w:val="single" w:color="BBBBBB" w:sz="1"/>
               <w:left w:val="single" w:color="BBBBBB" w:sz="1"/>
@@ -271,7 +337,7 @@
           </w:tcPr>
           <w:p>
             <w:r>
-              <w:t xml:space="preserve">148 sur 16 systemes</w:t>
+              <w:t xml:space="preserve">152 sur 16 systemes</w:t>
             </w:r>
           </w:p>
         </w:tc>
@@ -279,7 +345,7 @@
       <w:tr>
         <w:tc>
           <w:tcPr>
-            <w:tcW w:type="dxa" w:w="4680"/>
+            <w:tcW w:type="dxa" w:w="5400"/>
             <w:tcBorders>
               <w:top w:val="single" w:color="BBBBBB" w:sz="1"/>
               <w:left w:val="single" w:color="BBBBBB" w:sz="1"/>
@@ -302,7 +368,7 @@
         </w:tc>
         <w:tc>
           <w:tcPr>
-            <w:tcW w:type="dxa" w:w="4680"/>
+            <w:tcW w:type="dxa" w:w="3960"/>
             <w:tcBorders>
               <w:top w:val="single" w:color="BBBBBB" w:sz="1"/>
               <w:left w:val="single" w:color="BBBBBB" w:sz="1"/>
@@ -327,7 +393,7 @@
       <w:tr>
         <w:tc>
           <w:tcPr>
-            <w:tcW w:type="dxa" w:w="4680"/>
+            <w:tcW w:type="dxa" w:w="5400"/>
             <w:tcBorders>
               <w:top w:val="single" w:color="BBBBBB" w:sz="1"/>
               <w:left w:val="single" w:color="BBBBBB" w:sz="1"/>
@@ -344,13 +410,13 @@
           </w:tcPr>
           <w:p>
             <w:r>
-              <w:t xml:space="preserve">Campagnes de recette</w:t>
-            </w:r>
-          </w:p>
-        </w:tc>
-        <w:tc>
-          <w:tcPr>
-            <w:tcW w:type="dxa" w:w="4680"/>
+              <w:t xml:space="preserve">Providers LLM branchables (dont SKYNET via openai_compat)</w:t>
+            </w:r>
+          </w:p>
+        </w:tc>
+        <w:tc>
+          <w:tcPr>
+            <w:tcW w:type="dxa" w:w="3960"/>
             <w:tcBorders>
               <w:top w:val="single" w:color="BBBBBB" w:sz="1"/>
               <w:left w:val="single" w:color="BBBBBB" w:sz="1"/>
@@ -367,7 +433,7 @@
           </w:tcPr>
           <w:p>
             <w:r>
-              <w:t xml:space="preserve">55</w:t>
+              <w:t xml:space="preserve">31 + mock deterministe</w:t>
             </w:r>
           </w:p>
         </w:tc>
@@ -375,7 +441,7 @@
       <w:tr>
         <w:tc>
           <w:tcPr>
-            <w:tcW w:type="dxa" w:w="4680"/>
+            <w:tcW w:type="dxa" w:w="5400"/>
             <w:tcBorders>
               <w:top w:val="single" w:color="BBBBBB" w:sz="1"/>
               <w:left w:val="single" w:color="BBBBBB" w:sz="1"/>
@@ -392,13 +458,13 @@
           </w:tcPr>
           <w:p>
             <w:r>
-              <w:t xml:space="preserve">Agents runtime (cockpit)</w:t>
-            </w:r>
-          </w:p>
-        </w:tc>
-        <w:tc>
-          <w:tcPr>
-            <w:tcW w:type="dxa" w:w="4680"/>
+              <w:t xml:space="preserve">Templates de campagne</w:t>
+            </w:r>
+          </w:p>
+        </w:tc>
+        <w:tc>
+          <w:tcPr>
+            <w:tcW w:type="dxa" w:w="3960"/>
             <w:tcBorders>
               <w:top w:val="single" w:color="BBBBBB" w:sz="1"/>
               <w:left w:val="single" w:color="BBBBBB" w:sz="1"/>
@@ -415,7 +481,7 @@
           </w:tcPr>
           <w:p>
             <w:r>
-              <w:t xml:space="preserve">33</w:t>
+              <w:t xml:space="preserve">35 (3 profils, 11 systemes)</w:t>
             </w:r>
           </w:p>
         </w:tc>
@@ -423,7 +489,7 @@
       <w:tr>
         <w:tc>
           <w:tcPr>
-            <w:tcW w:type="dxa" w:w="4680"/>
+            <w:tcW w:type="dxa" w:w="5400"/>
             <w:tcBorders>
               <w:top w:val="single" w:color="BBBBBB" w:sz="1"/>
               <w:left w:val="single" w:color="BBBBBB" w:sz="1"/>
@@ -440,13 +506,13 @@
           </w:tcPr>
           <w:p>
             <w:r>
-              <w:t xml:space="preserve">Providers LLM branchables</w:t>
-            </w:r>
-          </w:p>
-        </w:tc>
-        <w:tc>
-          <w:tcPr>
-            <w:tcW w:type="dxa" w:w="4680"/>
+              <w:t xml:space="preserve">Agents runtime (cockpit)</w:t>
+            </w:r>
+          </w:p>
+        </w:tc>
+        <w:tc>
+          <w:tcPr>
+            <w:tcW w:type="dxa" w:w="3960"/>
             <w:tcBorders>
               <w:top w:val="single" w:color="BBBBBB" w:sz="1"/>
               <w:left w:val="single" w:color="BBBBBB" w:sz="1"/>
@@ -463,7 +529,7 @@
           </w:tcPr>
           <w:p>
             <w:r>
-              <w:t xml:space="preserve">31 (+ mock deterministe)</w:t>
+              <w:t xml:space="preserve">33</w:t>
             </w:r>
           </w:p>
         </w:tc>
@@ -471,7 +537,7 @@
       <w:tr>
         <w:tc>
           <w:tcPr>
-            <w:tcW w:type="dxa" w:w="4680"/>
+            <w:tcW w:type="dxa" w:w="5400"/>
             <w:tcBorders>
               <w:top w:val="single" w:color="BBBBBB" w:sz="1"/>
               <w:left w:val="single" w:color="BBBBBB" w:sz="1"/>
@@ -488,13 +554,13 @@
           </w:tcPr>
           <w:p>
             <w:r>
-              <w:t xml:space="preserve">Scenarios red-team</w:t>
-            </w:r>
-          </w:p>
-        </w:tc>
-        <w:tc>
-          <w:tcPr>
-            <w:tcW w:type="dxa" w:w="4680"/>
+              <w:t xml:space="preserve">Sujets d'identification (action-logs)</w:t>
+            </w:r>
+          </w:p>
+        </w:tc>
+        <w:tc>
+          <w:tcPr>
+            <w:tcW w:type="dxa" w:w="3960"/>
             <w:tcBorders>
               <w:top w:val="single" w:color="BBBBBB" w:sz="1"/>
               <w:left w:val="single" w:color="BBBBBB" w:sz="1"/>
@@ -511,7 +577,7 @@
           </w:tcPr>
           <w:p>
             <w:r>
-              <w:t xml:space="preserve">15</w:t>
+              <w:t xml:space="preserve">11</w:t>
             </w:r>
           </w:p>
         </w:tc>
@@ -519,7 +585,7 @@
       <w:tr>
         <w:tc>
           <w:tcPr>
-            <w:tcW w:type="dxa" w:w="4680"/>
+            <w:tcW w:type="dxa" w:w="5400"/>
             <w:tcBorders>
               <w:top w:val="single" w:color="BBBBBB" w:sz="1"/>
               <w:left w:val="single" w:color="BBBBBB" w:sz="1"/>
@@ -536,13 +602,13 @@
           </w:tcPr>
           <w:p>
             <w:r>
-              <w:t xml:space="preserve">Repos de discovery</w:t>
-            </w:r>
-          </w:p>
-        </w:tc>
-        <w:tc>
-          <w:tcPr>
-            <w:tcW w:type="dxa" w:w="4680"/>
+              <w:t xml:space="preserve">Sources de discovery (5 surfaces x 4 roles)</w:t>
+            </w:r>
+          </w:p>
+        </w:tc>
+        <w:tc>
+          <w:tcPr>
+            <w:tcW w:type="dxa" w:w="3960"/>
             <w:tcBorders>
               <w:top w:val="single" w:color="BBBBBB" w:sz="1"/>
               <w:left w:val="single" w:color="BBBBBB" w:sz="1"/>
@@ -559,7 +625,7 @@
           </w:tcPr>
           <w:p>
             <w:r>
-              <w:t xml:space="preserve">5</w:t>
+              <w:t xml:space="preserve">20</w:t>
             </w:r>
           </w:p>
         </w:tc>
@@ -567,7 +633,7 @@
       <w:tr>
         <w:tc>
           <w:tcPr>
-            <w:tcW w:type="dxa" w:w="4680"/>
+            <w:tcW w:type="dxa" w:w="5400"/>
             <w:tcBorders>
               <w:top w:val="single" w:color="BBBBBB" w:sz="1"/>
               <w:left w:val="single" w:color="BBBBBB" w:sz="1"/>
@@ -584,13 +650,13 @@
           </w:tcPr>
           <w:p>
             <w:r>
-              <w:t xml:space="preserve">Sujets d'identification (git + MAF)</w:t>
-            </w:r>
-          </w:p>
-        </w:tc>
-        <w:tc>
-          <w:tcPr>
-            <w:tcW w:type="dxa" w:w="4680"/>
+              <w:t xml:space="preserve">Scenarios red-team</w:t>
+            </w:r>
+          </w:p>
+        </w:tc>
+        <w:tc>
+          <w:tcPr>
+            <w:tcW w:type="dxa" w:w="3960"/>
             <w:tcBorders>
               <w:top w:val="single" w:color="BBBBBB" w:sz="1"/>
               <w:left w:val="single" w:color="BBBBBB" w:sz="1"/>
@@ -607,7 +673,55 @@
           </w:tcPr>
           <w:p>
             <w:r>
-              <w:t xml:space="preserve">16</w:t>
+              <w:t xml:space="preserve">15</w:t>
+            </w:r>
+          </w:p>
+        </w:tc>
+      </w:tr>
+      <w:tr>
+        <w:tc>
+          <w:tcPr>
+            <w:tcW w:type="dxa" w:w="5400"/>
+            <w:tcBorders>
+              <w:top w:val="single" w:color="BBBBBB" w:sz="1"/>
+              <w:left w:val="single" w:color="BBBBBB" w:sz="1"/>
+              <w:bottom w:val="single" w:color="BBBBBB" w:sz="1"/>
+              <w:right w:val="single" w:color="BBBBBB" w:sz="1"/>
+            </w:tcBorders>
+            <w:shd w:fill="FFFFFF" w:val="clear"/>
+            <w:tcMar>
+              <w:top w:type="dxa" w:w="60"/>
+              <w:left w:type="dxa" w:w="110"/>
+              <w:bottom w:type="dxa" w:w="60"/>
+              <w:right w:type="dxa" w:w="110"/>
+            </w:tcMar>
+          </w:tcPr>
+          <w:p>
+            <w:r>
+              <w:t xml:space="preserve">Serveurs lab (12 mock_local + 1 honeypot)</w:t>
+            </w:r>
+          </w:p>
+        </w:tc>
+        <w:tc>
+          <w:tcPr>
+            <w:tcW w:type="dxa" w:w="3960"/>
+            <w:tcBorders>
+              <w:top w:val="single" w:color="BBBBBB" w:sz="1"/>
+              <w:left w:val="single" w:color="BBBBBB" w:sz="1"/>
+              <w:bottom w:val="single" w:color="BBBBBB" w:sz="1"/>
+              <w:right w:val="single" w:color="BBBBBB" w:sz="1"/>
+            </w:tcBorders>
+            <w:shd w:fill="FFFFFF" w:val="clear"/>
+            <w:tcMar>
+              <w:top w:type="dxa" w:w="60"/>
+              <w:left w:type="dxa" w:w="110"/>
+              <w:bottom w:type="dxa" w:w="60"/>
+              <w:right w:type="dxa" w:w="110"/>
+            </w:tcMar>
+          </w:tcPr>
+          <w:p>
+            <w:r>
+              <w:t xml:space="preserve">13 (:9101-:9113) + lab :8082</w:t>
             </w:r>
           </w:p>
         </w:tc>
@@ -623,7 +737,7 @@
         <w:pStyle w:val="Heading1"/>
       </w:pPr>
       <w:r>
-        <w:t xml:space="preserve">2. Connecter SKYNET a inspect_ia_agents</w:t>
+        <w:t xml:space="preserve">2. SKYNET sert les agents (le cerveau)</w:t>
       </w:r>
     </w:p>
     <w:p>
@@ -631,7 +745,47 @@
         <w:spacing w:after="120"/>
       </w:pPr>
       <w:r>
-        <w:t xml:space="preserve">SKYNET est notre moteur de decision IA interne. Le branchement ne touche PAS le coeur de SKYNET : on l'expose comme un ai-backend de l'application, et toutes ses actions transitent par la couche de gouvernance. SKYNET propose ; la Gateway dispose.</w:t>
+        <w:t xml:space="preserve">Un agent du banc a </w:t>
+      </w:r>
+      <w:r>
+        <w:rPr>
+          <w:b/>
+          <w:bCs/>
+        </w:rPr>
+        <w:t xml:space="preserve">deux axes orthogonaux</w:t>
+      </w:r>
+      <w:r>
+        <w:t xml:space="preserve"> : son </w:t>
+      </w:r>
+      <w:r>
+        <w:rPr>
+          <w:b/>
+          <w:bCs/>
+        </w:rPr>
+        <w:t xml:space="preserve">cerveau</w:t>
+      </w:r>
+      <w:r>
+        <w:t xml:space="preserve"> (`ai_mode = mock | real`) et sa </w:t>
+      </w:r>
+      <w:r>
+        <w:rPr>
+          <w:b/>
+          <w:bCs/>
+        </w:rPr>
+        <w:t xml:space="preserve">cible</w:t>
+      </w:r>
+      <w:r>
+        <w:t xml:space="preserve"> (le serveur en face). SKYNET joue le cerveau en mode `real` : au lieu d'un scenario fige (mode `mock`, deterministe), c'est SKYNET qui </w:t>
+      </w:r>
+      <w:r>
+        <w:rPr>
+          <w:b/>
+          <w:bCs/>
+        </w:rPr>
+        <w:t xml:space="preserve">decide</w:t>
+      </w:r>
+      <w:r>
+        <w:t xml:space="preserve"> chaque appel d'outil dans la boucle Lane B.</w:t>
       </w:r>
     </w:p>
     <w:p>
@@ -642,9 +796,9 @@
       <w:r>
         <w:drawing>
           <wp:inline distT="0" distB="0" distL="0" distR="0">
-            <wp:extent cx="5905500" cy="1162050"/>
+            <wp:extent cx="5905500" cy="1562100"/>
             <wp:effectExtent t="0" r="0" b="0" l="0"/>
-            <wp:docPr id="1" name="00_skynet_integration" descr="Figure 1 -- SKYNET branche comme ai-backend, chaque action mediee par la Gateway et le proxy" title="Figure 1 -- SKYNET branche comme ai-backend, chaque action mediee par la Gateway et le proxy"/>
+            <wp:docPr id="1" name="00_skynet_serves_agents" descr="Figure 1 -- SKYNET sert les decisions des agents ; le banc execute, capte (proxy + eBPF) et score" title="Figure 1 -- SKYNET sert les decisions des agents ; le banc execute, capte (proxy + eBPF) et score"/>
             <wp:cNvGraphicFramePr>
               <a:graphicFrameLocks xmlns:a="http://schemas.openxmlformats.org/drawingml/2006/main" noChangeAspect="1"/>
             </wp:cNvGraphicFramePr>
@@ -667,7 +821,7 @@
                   <pic:spPr bwMode="auto">
                     <a:xfrm>
                       <a:off x="0" y="0"/>
-                      <a:ext cx="5905500" cy="1162050"/>
+                      <a:ext cx="5905500" cy="1562100"/>
                     </a:xfrm>
                     <a:prstGeom prst="rect">
                       <a:avLst/>
@@ -693,7 +847,7 @@
           <w:sz w:val="18"/>
           <w:szCs w:val="18"/>
         </w:rPr>
-        <w:t xml:space="preserve">Figure 1 -- SKYNET branche comme ai-backend, chaque action mediee par la Gateway et le proxy</w:t>
+        <w:t xml:space="preserve">Figure 1 -- SKYNET sert les decisions des agents ; le banc execute, capte (proxy + eBPF) et score</w:t>
       </w:r>
     </w:p>
     <w:p>
@@ -701,7 +855,7 @@
         <w:pStyle w:val="Heading2"/>
       </w:pPr>
       <w:r>
-        <w:t xml:space="preserve">Comment le branchement se fait concretement</w:t>
+        <w:t xml:space="preserve">Le branchement, concretement</w:t>
       </w:r>
     </w:p>
     <w:p>
@@ -721,7 +875,7 @@
         <w:t xml:space="preserve">Declarer SKYNET comme ai-backend</w:t>
       </w:r>
       <w:r>
-        <w:t xml:space="preserve"> : provider `openai_compat` (ou un provider dedie si le wire differe), `base_url` pointant l'endpoint SKYNET, cle dans `.env` / secret-store -- jamais en dur (R8).</w:t>
+        <w:t xml:space="preserve"> : provider `openai_compat` (ou provider dedie si le wire differe), `base_url` = endpoint SKYNET, cle dans `.env` / secret-store -- jamais en dur (R8). Le banc stocke provider + modele seulement ; la cle est lue de l'env au run.</w:t>
       </w:r>
     </w:p>
     <w:p>
@@ -738,10 +892,10 @@
           <w:b/>
           <w:bCs/>
         </w:rPr>
-        <w:t xml:space="preserve">Associer un agent</w:t>
-      </w:r>
-      <w:r>
-        <w:t xml:space="preserve"> : un agent runtime recoit `ai_backend_id = skynet`, un `goal`, un `target_system` et un `capability_scope` (les seuls outils que SKYNET pourra invoquer).</w:t>
+        <w:t xml:space="preserve">Mettre un agent en `ai_mode = real`</w:t>
+      </w:r>
+      <w:r>
+        <w:t xml:space="preserve"> avec `ai_backend_id = skynet`, un `goal`, un `target_system`, un `capability_scope`.</w:t>
       </w:r>
     </w:p>
     <w:p>
@@ -761,7 +915,7 @@
         <w:t xml:space="preserve">Lancer en Lane B</w:t>
       </w:r>
       <w:r>
-        <w:t xml:space="preserve"> : la boucle decide -&gt; act interroge SKYNET a chaque etape ; SKYNET renvoie un appel d'outil structure, l'application l'execute via la forge.</w:t>
+        <w:t xml:space="preserve"> : la boucle interroge SKYNET (`decide`) ; SKYNET renvoie un tool-call structure ; le banc l'execute via la forge ; le resultat revient en contexte ; on itere.</w:t>
       </w:r>
     </w:p>
     <w:p>
@@ -778,42 +932,646 @@
           <w:b/>
           <w:bCs/>
         </w:rPr>
-        <w:t xml:space="preserve">Gouverner chaque action</w:t>
-      </w:r>
-      <w:r>
-        <w:t xml:space="preserve"> : avant tout effet de bord, la Gateway evalue la policy (allow / deny / escalate). Une action sensible BLOQUE jusqu'a approbation (I6).</w:t>
-      </w:r>
-    </w:p>
-    <w:p>
-      <w:pPr>
-        <w:pStyle w:val="ListParagraph"/>
-        <w:numPr>
-          <w:ilvl w:val="0"/>
-          <w:numId w:val="2"/>
-        </w:numPr>
-        <w:spacing w:after="60"/>
-      </w:pPr>
+        <w:t xml:space="preserve">Enregistrer</w:t>
+      </w:r>
+      <w:r>
+        <w:t xml:space="preserve"> : un run sous SKYNET est non-deterministe, donc systematiquement enregistre (decisions, pas reponses brutes du provider) pour replay byte-identique (I4).</w:t>
+      </w:r>
+    </w:p>
+    <w:p>
+      <w:pPr>
+        <w:spacing w:after="120"/>
+      </w:pPr>
+      <w:r>
+        <w:t xml:space="preserve">SKYNET garde toute son intelligence de decision. Le banc lui donne un corps (les outils), une cible (les serveurs lab) et trois facons de l'observer.</w:t>
+      </w:r>
+    </w:p>
+    <w:p>
+      <w:r>
+        <w:br w:type="page"/>
+      </w:r>
+    </w:p>
+    <w:p>
+      <w:pPr>
+        <w:pStyle w:val="Heading1"/>
+      </w:pPr>
+      <w:r>
+        <w:t xml:space="preserve">3. Specificites des agents</w:t>
+      </w:r>
+    </w:p>
+    <w:p>
+      <w:pPr>
+        <w:pStyle w:val="Heading2"/>
+      </w:pPr>
+      <w:r>
+        <w:t xml:space="preserve">3.1 Deux axes orthogonaux</w:t>
+      </w:r>
+    </w:p>
+    <w:tbl>
+      <w:tblPr>
+        <w:tblW w:type="dxa" w:w="9360"/>
+        <w:tblBorders>
+          <w:top w:val="single" w:color="auto" w:sz="4"/>
+          <w:left w:val="single" w:color="auto" w:sz="4"/>
+          <w:bottom w:val="single" w:color="auto" w:sz="4"/>
+          <w:right w:val="single" w:color="auto" w:sz="4"/>
+          <w:insideH w:val="single" w:color="auto" w:sz="4"/>
+          <w:insideV w:val="single" w:color="auto" w:sz="4"/>
+        </w:tblBorders>
+      </w:tblPr>
+      <w:tblGrid>
+        <w:gridCol w:w="2400"/>
+        <w:gridCol w:w="2400"/>
+        <w:gridCol w:w="4560"/>
+      </w:tblGrid>
+      <w:tr>
+        <w:trPr>
+          <w:tblHeader/>
+        </w:trPr>
+        <w:tc>
+          <w:tcPr>
+            <w:tcW w:type="dxa" w:w="2400"/>
+            <w:tcBorders>
+              <w:top w:val="single" w:color="BBBBBB" w:sz="1"/>
+              <w:left w:val="single" w:color="BBBBBB" w:sz="1"/>
+              <w:bottom w:val="single" w:color="BBBBBB" w:sz="1"/>
+              <w:right w:val="single" w:color="BBBBBB" w:sz="1"/>
+            </w:tcBorders>
+            <w:shd w:fill="1F3864" w:val="clear"/>
+            <w:tcMar>
+              <w:top w:type="dxa" w:w="60"/>
+              <w:left w:type="dxa" w:w="110"/>
+              <w:bottom w:type="dxa" w:w="60"/>
+              <w:right w:type="dxa" w:w="110"/>
+            </w:tcMar>
+          </w:tcPr>
+          <w:p>
+            <w:r>
+              <w:rPr>
+                <w:b/>
+                <w:bCs/>
+                <w:color w:val="FFFFFF"/>
+                <w:sz w:val="19"/>
+                <w:szCs w:val="19"/>
+              </w:rPr>
+              <w:t xml:space="preserve">Axe</w:t>
+            </w:r>
+          </w:p>
+        </w:tc>
+        <w:tc>
+          <w:tcPr>
+            <w:tcW w:type="dxa" w:w="2400"/>
+            <w:tcBorders>
+              <w:top w:val="single" w:color="BBBBBB" w:sz="1"/>
+              <w:left w:val="single" w:color="BBBBBB" w:sz="1"/>
+              <w:bottom w:val="single" w:color="BBBBBB" w:sz="1"/>
+              <w:right w:val="single" w:color="BBBBBB" w:sz="1"/>
+            </w:tcBorders>
+            <w:shd w:fill="1F3864" w:val="clear"/>
+            <w:tcMar>
+              <w:top w:type="dxa" w:w="60"/>
+              <w:left w:type="dxa" w:w="110"/>
+              <w:bottom w:type="dxa" w:w="60"/>
+              <w:right w:type="dxa" w:w="110"/>
+            </w:tcMar>
+          </w:tcPr>
+          <w:p>
+            <w:r>
+              <w:rPr>
+                <w:b/>
+                <w:bCs/>
+                <w:color w:val="FFFFFF"/>
+                <w:sz w:val="19"/>
+                <w:szCs w:val="19"/>
+              </w:rPr>
+              <w:t xml:space="preserve">Valeurs</w:t>
+            </w:r>
+          </w:p>
+        </w:tc>
+        <w:tc>
+          <w:tcPr>
+            <w:tcW w:type="dxa" w:w="4560"/>
+            <w:tcBorders>
+              <w:top w:val="single" w:color="BBBBBB" w:sz="1"/>
+              <w:left w:val="single" w:color="BBBBBB" w:sz="1"/>
+              <w:bottom w:val="single" w:color="BBBBBB" w:sz="1"/>
+              <w:right w:val="single" w:color="BBBBBB" w:sz="1"/>
+            </w:tcBorders>
+            <w:shd w:fill="1F3864" w:val="clear"/>
+            <w:tcMar>
+              <w:top w:type="dxa" w:w="60"/>
+              <w:left w:type="dxa" w:w="110"/>
+              <w:bottom w:type="dxa" w:w="60"/>
+              <w:right w:type="dxa" w:w="110"/>
+            </w:tcMar>
+          </w:tcPr>
+          <w:p>
+            <w:r>
+              <w:rPr>
+                <w:b/>
+                <w:bCs/>
+                <w:color w:val="FFFFFF"/>
+                <w:sz w:val="19"/>
+                <w:szCs w:val="19"/>
+              </w:rPr>
+              <w:t xml:space="preserve">Ce que ca change</w:t>
+            </w:r>
+          </w:p>
+        </w:tc>
+      </w:tr>
+      <w:tr>
+        <w:tc>
+          <w:tcPr>
+            <w:tcW w:type="dxa" w:w="2400"/>
+            <w:tcBorders>
+              <w:top w:val="single" w:color="BBBBBB" w:sz="1"/>
+              <w:left w:val="single" w:color="BBBBBB" w:sz="1"/>
+              <w:bottom w:val="single" w:color="BBBBBB" w:sz="1"/>
+              <w:right w:val="single" w:color="BBBBBB" w:sz="1"/>
+            </w:tcBorders>
+            <w:shd w:fill="FFFFFF" w:val="clear"/>
+            <w:tcMar>
+              <w:top w:type="dxa" w:w="60"/>
+              <w:left w:type="dxa" w:w="110"/>
+              <w:bottom w:type="dxa" w:w="60"/>
+              <w:right w:type="dxa" w:w="110"/>
+            </w:tcMar>
+          </w:tcPr>
+          <w:p>
+            <w:r>
+              <w:t xml:space="preserve">Cerveau (`ai_mode`)</w:t>
+            </w:r>
+          </w:p>
+        </w:tc>
+        <w:tc>
+          <w:tcPr>
+            <w:tcW w:type="dxa" w:w="2400"/>
+            <w:tcBorders>
+              <w:top w:val="single" w:color="BBBBBB" w:sz="1"/>
+              <w:left w:val="single" w:color="BBBBBB" w:sz="1"/>
+              <w:bottom w:val="single" w:color="BBBBBB" w:sz="1"/>
+              <w:right w:val="single" w:color="BBBBBB" w:sz="1"/>
+            </w:tcBorders>
+            <w:shd w:fill="FFFFFF" w:val="clear"/>
+            <w:tcMar>
+              <w:top w:type="dxa" w:w="60"/>
+              <w:left w:type="dxa" w:w="110"/>
+              <w:bottom w:type="dxa" w:w="60"/>
+              <w:right w:type="dxa" w:w="110"/>
+            </w:tcMar>
+          </w:tcPr>
+          <w:p>
+            <w:r>
+              <w:t xml:space="preserve">mock | real</w:t>
+            </w:r>
+          </w:p>
+        </w:tc>
+        <w:tc>
+          <w:tcPr>
+            <w:tcW w:type="dxa" w:w="4560"/>
+            <w:tcBorders>
+              <w:top w:val="single" w:color="BBBBBB" w:sz="1"/>
+              <w:left w:val="single" w:color="BBBBBB" w:sz="1"/>
+              <w:bottom w:val="single" w:color="BBBBBB" w:sz="1"/>
+              <w:right w:val="single" w:color="BBBBBB" w:sz="1"/>
+            </w:tcBorders>
+            <w:shd w:fill="FFFFFF" w:val="clear"/>
+            <w:tcMar>
+              <w:top w:type="dxa" w:w="60"/>
+              <w:left w:type="dxa" w:w="110"/>
+              <w:bottom w:type="dxa" w:w="60"/>
+              <w:right w:type="dxa" w:w="110"/>
+            </w:tcMar>
+          </w:tcPr>
+          <w:p>
+            <w:r>
+              <w:t xml:space="preserve">mock = scenario fige via StubLlm (verite connue) ; real = SKYNET decide en live</w:t>
+            </w:r>
+          </w:p>
+        </w:tc>
+      </w:tr>
+      <w:tr>
+        <w:tc>
+          <w:tcPr>
+            <w:tcW w:type="dxa" w:w="2400"/>
+            <w:tcBorders>
+              <w:top w:val="single" w:color="BBBBBB" w:sz="1"/>
+              <w:left w:val="single" w:color="BBBBBB" w:sz="1"/>
+              <w:bottom w:val="single" w:color="BBBBBB" w:sz="1"/>
+              <w:right w:val="single" w:color="BBBBBB" w:sz="1"/>
+            </w:tcBorders>
+            <w:shd w:fill="EEF1F7" w:val="clear"/>
+            <w:tcMar>
+              <w:top w:type="dxa" w:w="60"/>
+              <w:left w:type="dxa" w:w="110"/>
+              <w:bottom w:type="dxa" w:w="60"/>
+              <w:right w:type="dxa" w:w="110"/>
+            </w:tcMar>
+          </w:tcPr>
+          <w:p>
+            <w:r>
+              <w:t xml:space="preserve">Cible (`runtime` + `server`)</w:t>
+            </w:r>
+          </w:p>
+        </w:tc>
+        <w:tc>
+          <w:tcPr>
+            <w:tcW w:type="dxa" w:w="2400"/>
+            <w:tcBorders>
+              <w:top w:val="single" w:color="BBBBBB" w:sz="1"/>
+              <w:left w:val="single" w:color="BBBBBB" w:sz="1"/>
+              <w:bottom w:val="single" w:color="BBBBBB" w:sz="1"/>
+              <w:right w:val="single" w:color="BBBBBB" w:sz="1"/>
+            </w:tcBorders>
+            <w:shd w:fill="EEF1F7" w:val="clear"/>
+            <w:tcMar>
+              <w:top w:type="dxa" w:w="60"/>
+              <w:left w:type="dxa" w:w="110"/>
+              <w:bottom w:type="dxa" w:w="60"/>
+              <w:right w:type="dxa" w:w="110"/>
+            </w:tcMar>
+          </w:tcPr>
+          <w:p>
+            <w:r>
+              <w:t xml:space="preserve">lab | real ; binding serveur</w:t>
+            </w:r>
+          </w:p>
+        </w:tc>
+        <w:tc>
+          <w:tcPr>
+            <w:tcW w:type="dxa" w:w="4560"/>
+            <w:tcBorders>
+              <w:top w:val="single" w:color="BBBBBB" w:sz="1"/>
+              <w:left w:val="single" w:color="BBBBBB" w:sz="1"/>
+              <w:bottom w:val="single" w:color="BBBBBB" w:sz="1"/>
+              <w:right w:val="single" w:color="BBBBBB" w:sz="1"/>
+            </w:tcBorders>
+            <w:shd w:fill="EEF1F7" w:val="clear"/>
+            <w:tcMar>
+              <w:top w:type="dxa" w:w="60"/>
+              <w:left w:type="dxa" w:w="110"/>
+              <w:bottom w:type="dxa" w:w="60"/>
+              <w:right w:type="dxa" w:w="110"/>
+            </w:tcMar>
+          </w:tcPr>
+          <w:p>
+            <w:r>
+              <w:t xml:space="preserve">sans binding = LabForge in-memory ; avec binding = vrai HTTP via ProxyForge</w:t>
+            </w:r>
+          </w:p>
+        </w:tc>
+      </w:tr>
+    </w:tbl>
+    <w:p>
+      <w:pPr>
+        <w:pStyle w:val="Heading2"/>
+      </w:pPr>
+      <w:r>
+        <w:t xml:space="preserve">3.2 Trois formes d'un meme agent (ne jamais confondre)</w:t>
+      </w:r>
+    </w:p>
+    <w:tbl>
+      <w:tblPr>
+        <w:tblW w:type="dxa" w:w="9360"/>
+        <w:tblBorders>
+          <w:top w:val="single" w:color="auto" w:sz="4"/>
+          <w:left w:val="single" w:color="auto" w:sz="4"/>
+          <w:bottom w:val="single" w:color="auto" w:sz="4"/>
+          <w:right w:val="single" w:color="auto" w:sz="4"/>
+          <w:insideH w:val="single" w:color="auto" w:sz="4"/>
+          <w:insideV w:val="single" w:color="auto" w:sz="4"/>
+        </w:tblBorders>
+      </w:tblPr>
+      <w:tblGrid>
+        <w:gridCol w:w="2200"/>
+        <w:gridCol w:w="4360"/>
+        <w:gridCol w:w="2800"/>
+      </w:tblGrid>
+      <w:tr>
+        <w:trPr>
+          <w:tblHeader/>
+        </w:trPr>
+        <w:tc>
+          <w:tcPr>
+            <w:tcW w:type="dxa" w:w="2200"/>
+            <w:tcBorders>
+              <w:top w:val="single" w:color="BBBBBB" w:sz="1"/>
+              <w:left w:val="single" w:color="BBBBBB" w:sz="1"/>
+              <w:bottom w:val="single" w:color="BBBBBB" w:sz="1"/>
+              <w:right w:val="single" w:color="BBBBBB" w:sz="1"/>
+            </w:tcBorders>
+            <w:shd w:fill="1F3864" w:val="clear"/>
+            <w:tcMar>
+              <w:top w:type="dxa" w:w="60"/>
+              <w:left w:type="dxa" w:w="110"/>
+              <w:bottom w:type="dxa" w:w="60"/>
+              <w:right w:type="dxa" w:w="110"/>
+            </w:tcMar>
+          </w:tcPr>
+          <w:p>
+            <w:r>
+              <w:rPr>
+                <w:b/>
+                <w:bCs/>
+                <w:color w:val="FFFFFF"/>
+                <w:sz w:val="19"/>
+                <w:szCs w:val="19"/>
+              </w:rPr>
+              <w:t xml:space="preserve">Forme</w:t>
+            </w:r>
+          </w:p>
+        </w:tc>
+        <w:tc>
+          <w:tcPr>
+            <w:tcW w:type="dxa" w:w="4360"/>
+            <w:tcBorders>
+              <w:top w:val="single" w:color="BBBBBB" w:sz="1"/>
+              <w:left w:val="single" w:color="BBBBBB" w:sz="1"/>
+              <w:bottom w:val="single" w:color="BBBBBB" w:sz="1"/>
+              <w:right w:val="single" w:color="BBBBBB" w:sz="1"/>
+            </w:tcBorders>
+            <w:shd w:fill="1F3864" w:val="clear"/>
+            <w:tcMar>
+              <w:top w:type="dxa" w:w="60"/>
+              <w:left w:type="dxa" w:w="110"/>
+              <w:bottom w:type="dxa" w:w="60"/>
+              <w:right w:type="dxa" w:w="110"/>
+            </w:tcMar>
+          </w:tcPr>
+          <w:p>
+            <w:r>
+              <w:rPr>
+                <w:b/>
+                <w:bCs/>
+                <w:color w:val="FFFFFF"/>
+                <w:sz w:val="19"/>
+                <w:szCs w:val="19"/>
+              </w:rPr>
+              <w:t xml:space="preserve">Ou</w:t>
+            </w:r>
+          </w:p>
+        </w:tc>
+        <w:tc>
+          <w:tcPr>
+            <w:tcW w:type="dxa" w:w="2800"/>
+            <w:tcBorders>
+              <w:top w:val="single" w:color="BBBBBB" w:sz="1"/>
+              <w:left w:val="single" w:color="BBBBBB" w:sz="1"/>
+              <w:bottom w:val="single" w:color="BBBBBB" w:sz="1"/>
+              <w:right w:val="single" w:color="BBBBBB" w:sz="1"/>
+            </w:tcBorders>
+            <w:shd w:fill="1F3864" w:val="clear"/>
+            <w:tcMar>
+              <w:top w:type="dxa" w:w="60"/>
+              <w:left w:type="dxa" w:w="110"/>
+              <w:bottom w:type="dxa" w:w="60"/>
+              <w:right w:type="dxa" w:w="110"/>
+            </w:tcMar>
+          </w:tcPr>
+          <w:p>
+            <w:r>
+              <w:rPr>
+                <w:b/>
+                <w:bCs/>
+                <w:color w:val="FFFFFF"/>
+                <w:sz w:val="19"/>
+                <w:szCs w:val="19"/>
+              </w:rPr>
+              <w:t xml:space="preserve">Qui la consomme</w:t>
+            </w:r>
+          </w:p>
+        </w:tc>
+      </w:tr>
+      <w:tr>
+        <w:tc>
+          <w:tcPr>
+            <w:tcW w:type="dxa" w:w="2200"/>
+            <w:tcBorders>
+              <w:top w:val="single" w:color="BBBBBB" w:sz="1"/>
+              <w:left w:val="single" w:color="BBBBBB" w:sz="1"/>
+              <w:bottom w:val="single" w:color="BBBBBB" w:sz="1"/>
+              <w:right w:val="single" w:color="BBBBBB" w:sz="1"/>
+            </w:tcBorders>
+            <w:shd w:fill="FFFFFF" w:val="clear"/>
+            <w:tcMar>
+              <w:top w:type="dxa" w:w="60"/>
+              <w:left w:type="dxa" w:w="110"/>
+              <w:bottom w:type="dxa" w:w="60"/>
+              <w:right w:type="dxa" w:w="110"/>
+            </w:tcMar>
+          </w:tcPr>
+          <w:p>
+            <w:r>
+              <w:t xml:space="preserve">Agent runtime</w:t>
+            </w:r>
+          </w:p>
+        </w:tc>
+        <w:tc>
+          <w:tcPr>
+            <w:tcW w:type="dxa" w:w="4360"/>
+            <w:tcBorders>
+              <w:top w:val="single" w:color="BBBBBB" w:sz="1"/>
+              <w:left w:val="single" w:color="BBBBBB" w:sz="1"/>
+              <w:bottom w:val="single" w:color="BBBBBB" w:sz="1"/>
+              <w:right w:val="single" w:color="BBBBBB" w:sz="1"/>
+            </w:tcBorders>
+            <w:shd w:fill="FFFFFF" w:val="clear"/>
+            <w:tcMar>
+              <w:top w:type="dxa" w:w="60"/>
+              <w:left w:type="dxa" w:w="110"/>
+              <w:bottom w:type="dxa" w:w="60"/>
+              <w:right w:type="dxa" w:w="110"/>
+            </w:tcMar>
+          </w:tcPr>
+          <w:p>
+            <w:r>
+              <w:t xml:space="preserve">config + cockpit (bouton Lancer)</w:t>
+            </w:r>
+          </w:p>
+        </w:tc>
+        <w:tc>
+          <w:tcPr>
+            <w:tcW w:type="dxa" w:w="2800"/>
+            <w:tcBorders>
+              <w:top w:val="single" w:color="BBBBBB" w:sz="1"/>
+              <w:left w:val="single" w:color="BBBBBB" w:sz="1"/>
+              <w:bottom w:val="single" w:color="BBBBBB" w:sz="1"/>
+              <w:right w:val="single" w:color="BBBBBB" w:sz="1"/>
+            </w:tcBorders>
+            <w:shd w:fill="FFFFFF" w:val="clear"/>
+            <w:tcMar>
+              <w:top w:type="dxa" w:w="60"/>
+              <w:left w:type="dxa" w:w="110"/>
+              <w:bottom w:type="dxa" w:w="60"/>
+              <w:right w:type="dxa" w:w="110"/>
+            </w:tcMar>
+          </w:tcPr>
+          <w:p>
+            <w:r>
+              <w:t xml:space="preserve">produit un action-log -- alimente l'identification</w:t>
+            </w:r>
+          </w:p>
+        </w:tc>
+      </w:tr>
+      <w:tr>
+        <w:tc>
+          <w:tcPr>
+            <w:tcW w:type="dxa" w:w="2200"/>
+            <w:tcBorders>
+              <w:top w:val="single" w:color="BBBBBB" w:sz="1"/>
+              <w:left w:val="single" w:color="BBBBBB" w:sz="1"/>
+              <w:bottom w:val="single" w:color="BBBBBB" w:sz="1"/>
+              <w:right w:val="single" w:color="BBBBBB" w:sz="1"/>
+            </w:tcBorders>
+            <w:shd w:fill="EEF1F7" w:val="clear"/>
+            <w:tcMar>
+              <w:top w:type="dxa" w:w="60"/>
+              <w:left w:type="dxa" w:w="110"/>
+              <w:bottom w:type="dxa" w:w="60"/>
+              <w:right w:type="dxa" w:w="110"/>
+            </w:tcMar>
+          </w:tcPr>
+          <w:p>
+            <w:r>
+              <w:t xml:space="preserve">Sujet d'identification</w:t>
+            </w:r>
+          </w:p>
+        </w:tc>
+        <w:tc>
+          <w:tcPr>
+            <w:tcW w:type="dxa" w:w="4360"/>
+            <w:tcBorders>
+              <w:top w:val="single" w:color="BBBBBB" w:sz="1"/>
+              <w:left w:val="single" w:color="BBBBBB" w:sz="1"/>
+              <w:bottom w:val="single" w:color="BBBBBB" w:sz="1"/>
+              <w:right w:val="single" w:color="BBBBBB" w:sz="1"/>
+            </w:tcBorders>
+            <w:shd w:fill="EEF1F7" w:val="clear"/>
+            <w:tcMar>
+              <w:top w:type="dxa" w:w="60"/>
+              <w:left w:type="dxa" w:w="110"/>
+              <w:bottom w:type="dxa" w:w="60"/>
+              <w:right w:type="dxa" w:w="110"/>
+            </w:tcMar>
+          </w:tcPr>
+          <w:p>
+            <w:r>
+              <w:t xml:space="preserve">corpus/agents/ (action-log fige + ground-truth)</w:t>
+            </w:r>
+          </w:p>
+        </w:tc>
+        <w:tc>
+          <w:tcPr>
+            <w:tcW w:type="dxa" w:w="2800"/>
+            <w:tcBorders>
+              <w:top w:val="single" w:color="BBBBBB" w:sz="1"/>
+              <w:left w:val="single" w:color="BBBBBB" w:sz="1"/>
+              <w:bottom w:val="single" w:color="BBBBBB" w:sz="1"/>
+              <w:right w:val="single" w:color="BBBBBB" w:sz="1"/>
+            </w:tcBorders>
+            <w:shd w:fill="EEF1F7" w:val="clear"/>
+            <w:tcMar>
+              <w:top w:type="dxa" w:w="60"/>
+              <w:left w:type="dxa" w:w="110"/>
+              <w:bottom w:type="dxa" w:w="60"/>
+              <w:right w:type="dxa" w:w="110"/>
+            </w:tcMar>
+          </w:tcPr>
+          <w:p>
+            <w:r>
+              <w:t xml:space="preserve">outil d'identification (juge 4 dimensions)</w:t>
+            </w:r>
+          </w:p>
+        </w:tc>
+      </w:tr>
+      <w:tr>
+        <w:tc>
+          <w:tcPr>
+            <w:tcW w:type="dxa" w:w="2200"/>
+            <w:tcBorders>
+              <w:top w:val="single" w:color="BBBBBB" w:sz="1"/>
+              <w:left w:val="single" w:color="BBBBBB" w:sz="1"/>
+              <w:bottom w:val="single" w:color="BBBBBB" w:sz="1"/>
+              <w:right w:val="single" w:color="BBBBBB" w:sz="1"/>
+            </w:tcBorders>
+            <w:shd w:fill="FFFFFF" w:val="clear"/>
+            <w:tcMar>
+              <w:top w:type="dxa" w:w="60"/>
+              <w:left w:type="dxa" w:w="110"/>
+              <w:bottom w:type="dxa" w:w="60"/>
+              <w:right w:type="dxa" w:w="110"/>
+            </w:tcMar>
+          </w:tcPr>
+          <w:p>
+            <w:r>
+              <w:t xml:space="preserve">Sujet de discovery</w:t>
+            </w:r>
+          </w:p>
+        </w:tc>
+        <w:tc>
+          <w:tcPr>
+            <w:tcW w:type="dxa" w:w="4360"/>
+            <w:tcBorders>
+              <w:top w:val="single" w:color="BBBBBB" w:sz="1"/>
+              <w:left w:val="single" w:color="BBBBBB" w:sz="1"/>
+              <w:bottom w:val="single" w:color="BBBBBB" w:sz="1"/>
+              <w:right w:val="single" w:color="BBBBBB" w:sz="1"/>
+            </w:tcBorders>
+            <w:shd w:fill="FFFFFF" w:val="clear"/>
+            <w:tcMar>
+              <w:top w:type="dxa" w:w="60"/>
+              <w:left w:type="dxa" w:w="110"/>
+              <w:bottom w:type="dxa" w:w="60"/>
+              <w:right w:type="dxa" w:w="110"/>
+            </w:tcMar>
+          </w:tcPr>
+          <w:p>
+            <w:r>
+              <w:t xml:space="preserve">corpus/repos/ (vrai repo publiable)</w:t>
+            </w:r>
+          </w:p>
+        </w:tc>
+        <w:tc>
+          <w:tcPr>
+            <w:tcW w:type="dxa" w:w="2800"/>
+            <w:tcBorders>
+              <w:top w:val="single" w:color="BBBBBB" w:sz="1"/>
+              <w:left w:val="single" w:color="BBBBBB" w:sz="1"/>
+              <w:bottom w:val="single" w:color="BBBBBB" w:sz="1"/>
+              <w:right w:val="single" w:color="BBBBBB" w:sz="1"/>
+            </w:tcBorders>
+            <w:shd w:fill="FFFFFF" w:val="clear"/>
+            <w:tcMar>
+              <w:top w:type="dxa" w:w="60"/>
+              <w:left w:type="dxa" w:w="110"/>
+              <w:bottom w:type="dxa" w:w="60"/>
+              <w:right w:type="dxa" w:w="110"/>
+            </w:tcMar>
+          </w:tcPr>
+          <w:p>
+            <w:r>
+              <w:t xml:space="preserve">outil de discovery (scanner de sources)</w:t>
+            </w:r>
+          </w:p>
+        </w:tc>
+      </w:tr>
+    </w:tbl>
+    <w:p>
+      <w:pPr>
+        <w:spacing w:after="120"/>
+      </w:pPr>
+      <w:r>
+        <w:t xml:space="preserve">La discovery ne voit JAMAIS le runtime (elle lit la source) ; l'identification ne voit JAMAIS la source (elle juge un action-log). L'ecart </w:t>
+      </w:r>
       <w:r>
         <w:rPr>
           <w:b/>
           <w:bCs/>
         </w:rPr>
-        <w:t xml:space="preserve">Tracer + rejouer</w:t>
-      </w:r>
-      <w:r>
-        <w:t xml:space="preserve"> : chaque echange (requete + reponse serveur) est capture en ProxyTrace ; chaque run est un enregistrement rejouable a l'identique (I4).</w:t>
-      </w:r>
-    </w:p>
-    <w:p>
-      <w:pPr>
-        <w:spacing w:after="120"/>
-      </w:pPr>
-      <w:r>
-        <w:rPr>
-          <w:i/>
-          <w:iCs/>
-        </w:rPr>
-        <w:t xml:space="preserve">Resultat : SKYNET garde son intelligence de decision, mais perd la capacite d'agir hors cadre. Toute tentative hors perimetre devient un evenement audite, pas un effet de bord silencieux.</w:t>
+        <w:t xml:space="preserve">declare (manifest) vs reel (action-log)</w:t>
+      </w:r>
+      <w:r>
+        <w:t xml:space="preserve"> est ce qui rend un agent correct ou incorrect.</w:t>
       </w:r>
     </w:p>
     <w:p>
@@ -821,7 +1579,7 @@
         <w:pStyle w:val="Heading2"/>
       </w:pPr>
       <w:r>
-        <w:t xml:space="preserve">Ce que ce branchement nous donne</w:t>
+        <w:t xml:space="preserve">3.3 Deux familles, un seul modele</w:t>
       </w:r>
     </w:p>
     <w:p>
@@ -838,10 +1596,10 @@
           <w:b/>
           <w:bCs/>
         </w:rPr>
-        <w:t xml:space="preserve">Lisibilite</w:t>
-      </w:r>
-      <w:r>
-        <w:t xml:space="preserve"> : on voit ce que SKYNET demande ET ce que le serveur repond, sans instrumenter SKYNET.</w:t>
+        <w:t xml:space="preserve">Agents git</w:t>
+      </w:r>
+      <w:r>
+        <w:t xml:space="preserve"> (github / gitlab) : actions canoniques `read_repo`, `open_pr`, `merge_pr`, `push`, `manage_webhook`...</w:t>
       </w:r>
     </w:p>
     <w:p>
@@ -858,10 +1616,10 @@
           <w:b/>
           <w:bCs/>
         </w:rPr>
-        <w:t xml:space="preserve">Confinement</w:t>
-      </w:r>
-      <w:r>
-        <w:t xml:space="preserve"> : SKYNET ne peut invoquer que les outils de son `capability_scope` ; le reste est deny-by-default.</w:t>
+        <w:t xml:space="preserve">Agents MAF</w:t>
+      </w:r>
+      <w:r>
+        <w:t xml:space="preserve"> (Microsoft Agent Framework) : capacites tool/handoff (`mcp`, `function`, `web_search`, `code_interpreter`), approbation `never | always`, orchestration multi-agents (handoffs bornes).</w:t>
       </w:r>
     </w:p>
     <w:p>
@@ -878,59 +1636,51 @@
           <w:b/>
           <w:bCs/>
         </w:rPr>
-        <w:t xml:space="preserve">Auditabilite</w:t>
-      </w:r>
-      <w:r>
-        <w:t xml:space="preserve"> : chaque decision de gouvernance est rejouable et opposable (meme stream + meme policy =&gt; meme verdict).</w:t>
-      </w:r>
-    </w:p>
-    <w:p>
-      <w:pPr>
-        <w:pStyle w:val="ListParagraph"/>
-        <w:numPr>
-          <w:ilvl w:val="0"/>
-          <w:numId w:val="3"/>
-        </w:numPr>
-        <w:spacing w:after="60"/>
-      </w:pPr>
+        <w:t xml:space="preserve">Corpus negatifs mono-axe</w:t>
+      </w:r>
+      <w:r>
+        <w:t xml:space="preserve"> : un agent incorrect casse EXACTEMENT une des 4 dimensions (identity / capabilities / policy / behavior) ; les 3 autres restent conformes -- accuracy mesurable par dimension.</w:t>
+      </w:r>
+    </w:p>
+    <w:p>
+      <w:r>
+        <w:br w:type="page"/>
+      </w:r>
+    </w:p>
+    <w:p>
+      <w:pPr>
+        <w:pStyle w:val="Heading1"/>
+      </w:pPr>
+      <w:r>
+        <w:t xml:space="preserve">4. Proprietes des serveurs (la cible en face)</w:t>
+      </w:r>
+    </w:p>
+    <w:p>
+      <w:pPr>
+        <w:spacing w:after="120"/>
+      </w:pPr>
+      <w:r>
+        <w:t xml:space="preserve">Le "en face" d'un agent est choisi par le </w:t>
+      </w:r>
       <w:r>
         <w:rPr>
           <w:b/>
           <w:bCs/>
         </w:rPr>
-        <w:t xml:space="preserve">Test adversarial</w:t>
-      </w:r>
-      <w:r>
-        <w:t xml:space="preserve"> : on peut red-teamer SKYNET (injection, coercition) et mesurer s'il derive.</w:t>
-      </w:r>
-    </w:p>
-    <w:p>
-      <w:r>
-        <w:br w:type="page"/>
-      </w:r>
-    </w:p>
-    <w:p>
-      <w:pPr>
-        <w:pStyle w:val="Heading1"/>
-      </w:pPr>
-      <w:r>
-        <w:t xml:space="preserve">3. Le fil : de l'observation au controle</w:t>
-      </w:r>
-    </w:p>
-    <w:p>
-      <w:pPr>
-        <w:pStyle w:val="Heading2"/>
-      </w:pPr>
-      <w:r>
-        <w:t xml:space="preserve">3.1 Comprendre la communication agent &lt;-&gt; serveur</w:t>
-      </w:r>
-    </w:p>
-    <w:p>
-      <w:pPr>
-        <w:spacing w:after="120"/>
-      </w:pPr>
-      <w:r>
-        <w:t xml:space="preserve">Tout effet de bord passe par un proxy mediatise (invariant I5) qui capture l'echange complet en ProxyTrace : la requete (action_type + resource + payload) ET la reponse du serveur, avec un hash deterministe. C'est la couche qui rend lisible ce que l'agent FAIT vraiment.</w:t>
+        <w:t xml:space="preserve">registre de serveurs</w:t>
+      </w:r>
+      <w:r>
+        <w:t xml:space="preserve"> (`servers[]` du ConfigStore) et le champ `server` de l'agent. Trois modes, routage </w:t>
+      </w:r>
+      <w:r>
+        <w:rPr>
+          <w:b/>
+          <w:bCs/>
+        </w:rPr>
+        <w:t xml:space="preserve">fail-safe</w:t>
+      </w:r>
+      <w:r>
+        <w:t xml:space="preserve"> : une reference pendante ou un mode inconnu fait ECHOUER le run (jamais d'effet de bord contre le mauvais systeme -- I5).</w:t>
       </w:r>
     </w:p>
     <w:p>
@@ -941,9 +1691,9 @@
       <w:r>
         <w:drawing>
           <wp:inline distT="0" distB="0" distL="0" distR="0">
-            <wp:extent cx="5905500" cy="3429000"/>
+            <wp:extent cx="5905500" cy="3276600"/>
             <wp:effectExtent t="0" r="0" b="0" l="0"/>
-            <wp:docPr id="1" name="07_laneb_sequence" descr="Figure 2 -- Boucle decide -&gt; act : l'IA decide, l'outil s'execute via la forge, tout est enregistre" title="Figure 2 -- Boucle decide -&gt; act : l'IA decide, l'outil s'execute via la forge, tout est enregistre"/>
+            <wp:docPr id="1" name="04_lab_topology" descr="Figure 2 -- Topologie agents &lt;-&gt; serveurs : trois modes de cible, routage fail-safe (I5)" title="Figure 2 -- Topologie agents &lt;-&gt; serveurs : trois modes de cible, routage fail-safe (I5)"/>
             <wp:cNvGraphicFramePr>
               <a:graphicFrameLocks xmlns:a="http://schemas.openxmlformats.org/drawingml/2006/main" noChangeAspect="1"/>
             </wp:cNvGraphicFramePr>
@@ -966,7 +1716,7 @@
                   <pic:spPr bwMode="auto">
                     <a:xfrm>
                       <a:off x="0" y="0"/>
-                      <a:ext cx="5905500" cy="3429000"/>
+                      <a:ext cx="5905500" cy="3276600"/>
                     </a:xfrm>
                     <a:prstGeom prst="rect">
                       <a:avLst/>
@@ -992,23 +1742,7 @@
           <w:sz w:val="18"/>
           <w:szCs w:val="18"/>
         </w:rPr>
-        <w:t xml:space="preserve">Figure 2 -- Boucle decide -&gt; act : l'IA decide, l'outil s'execute via la forge, tout est enregistre</w:t>
-      </w:r>
-    </w:p>
-    <w:p>
-      <w:pPr>
-        <w:pStyle w:val="Heading2"/>
-      </w:pPr>
-      <w:r>
-        <w:t xml:space="preserve">3.2 Montrer qu'on peut influencer cette communication (red-team)</w:t>
-      </w:r>
-    </w:p>
-    <w:p>
-      <w:pPr>
-        <w:spacing w:after="120"/>
-      </w:pPr>
-      <w:r>
-        <w:t xml:space="preserve">La red-team modelise, de facon deterministe et rejouable, comment un adversaire detourne la communication :</w:t>
+        <w:t xml:space="preserve">Figure 2 -- Topologie agents &lt;-&gt; serveurs : trois modes de cible, routage fail-safe (I5)</w:t>
       </w:r>
     </w:p>
     <w:tbl>
@@ -1024,9 +1758,9 @@
         </w:tblBorders>
       </w:tblPr>
       <w:tblGrid>
-        <w:gridCol w:w="2200"/>
-        <w:gridCol w:w="4360"/>
-        <w:gridCol w:w="2800"/>
+        <w:gridCol w:w="1700"/>
+        <w:gridCol w:w="3400"/>
+        <w:gridCol w:w="4260"/>
       </w:tblGrid>
       <w:tr>
         <w:trPr>
@@ -1034,7 +1768,7 @@
         </w:trPr>
         <w:tc>
           <w:tcPr>
-            <w:tcW w:type="dxa" w:w="2200"/>
+            <w:tcW w:type="dxa" w:w="1700"/>
             <w:tcBorders>
               <w:top w:val="single" w:color="BBBBBB" w:sz="1"/>
               <w:left w:val="single" w:color="BBBBBB" w:sz="1"/>
@@ -1058,13 +1792,13 @@
                 <w:sz w:val="19"/>
                 <w:szCs w:val="19"/>
               </w:rPr>
-              <w:t xml:space="preserve">Mecanisme</w:t>
-            </w:r>
-          </w:p>
-        </w:tc>
-        <w:tc>
-          <w:tcPr>
-            <w:tcW w:type="dxa" w:w="4360"/>
+              <w:t xml:space="preserve">Mode</w:t>
+            </w:r>
+          </w:p>
+        </w:tc>
+        <w:tc>
+          <w:tcPr>
+            <w:tcW w:type="dxa" w:w="3400"/>
             <w:tcBorders>
               <w:top w:val="single" w:color="BBBBBB" w:sz="1"/>
               <w:left w:val="single" w:color="BBBBBB" w:sz="1"/>
@@ -1088,13 +1822,13 @@
                 <w:sz w:val="19"/>
                 <w:szCs w:val="19"/>
               </w:rPr>
-              <w:t xml:space="preserve">Effet sur la communication</w:t>
-            </w:r>
-          </w:p>
-        </w:tc>
-        <w:tc>
-          <w:tcPr>
-            <w:tcW w:type="dxa" w:w="2800"/>
+              <w:t xml:space="preserve">Implementation</w:t>
+            </w:r>
+          </w:p>
+        </w:tc>
+        <w:tc>
+          <w:tcPr>
+            <w:tcW w:type="dxa" w:w="4260"/>
             <w:tcBorders>
               <w:top w:val="single" w:color="BBBBBB" w:sz="1"/>
               <w:left w:val="single" w:color="BBBBBB" w:sz="1"/>
@@ -1118,7 +1852,7 @@
                 <w:sz w:val="19"/>
                 <w:szCs w:val="19"/>
               </w:rPr>
-              <w:t xml:space="preserve">OWASP Agentic 2026</w:t>
+              <w:t xml:space="preserve">Comportement</w:t>
             </w:r>
           </w:p>
         </w:tc>
@@ -1126,7 +1860,7 @@
       <w:tr>
         <w:tc>
           <w:tcPr>
-            <w:tcW w:type="dxa" w:w="2200"/>
+            <w:tcW w:type="dxa" w:w="1700"/>
             <w:tcBorders>
               <w:top w:val="single" w:color="BBBBBB" w:sz="1"/>
               <w:left w:val="single" w:color="BBBBBB" w:sz="1"/>
@@ -1143,13 +1877,13 @@
           </w:tcPr>
           <w:p>
             <w:r>
-              <w:t xml:space="preserve">Context / tool poisoning</w:t>
-            </w:r>
-          </w:p>
-        </w:tc>
-        <w:tc>
-          <w:tcPr>
-            <w:tcW w:type="dxa" w:w="4360"/>
+              <w:t xml:space="preserve">(pas de binding)</w:t>
+            </w:r>
+          </w:p>
+        </w:tc>
+        <w:tc>
+          <w:tcPr>
+            <w:tcW w:type="dxa" w:w="3400"/>
             <w:tcBorders>
               <w:top w:val="single" w:color="BBBBBB" w:sz="1"/>
               <w:left w:val="single" w:color="BBBBBB" w:sz="1"/>
@@ -1166,13 +1900,13 @@
           </w:tcPr>
           <w:p>
             <w:r>
-              <w:t xml:space="preserve">La reponse d'un outil est empoisonnee et pilote la decision suivante</w:t>
-            </w:r>
-          </w:p>
-        </w:tc>
-        <w:tc>
-          <w:tcPr>
-            <w:tcW w:type="dxa" w:w="2800"/>
+              <w:t xml:space="preserve">LabForge in-memory</w:t>
+            </w:r>
+          </w:p>
+        </w:tc>
+        <w:tc>
+          <w:tcPr>
+            <w:tcW w:type="dxa" w:w="4260"/>
             <w:tcBorders>
               <w:top w:val="single" w:color="BBBBBB" w:sz="1"/>
               <w:left w:val="single" w:color="BBBBBB" w:sz="1"/>
@@ -1189,7 +1923,7 @@
           </w:tcPr>
           <w:p>
             <w:r>
-              <w:t xml:space="preserve">ASI06 / ATLAS AML.T0110</w:t>
+              <w:t xml:space="preserve">in-process, aucun trafic reseau -- le quotidien deterministe</w:t>
             </w:r>
           </w:p>
         </w:tc>
@@ -1197,7 +1931,7 @@
       <w:tr>
         <w:tc>
           <w:tcPr>
-            <w:tcW w:type="dxa" w:w="2200"/>
+            <w:tcW w:type="dxa" w:w="1700"/>
             <w:tcBorders>
               <w:top w:val="single" w:color="BBBBBB" w:sz="1"/>
               <w:left w:val="single" w:color="BBBBBB" w:sz="1"/>
@@ -1214,13 +1948,13 @@
           </w:tcPr>
           <w:p>
             <w:r>
-              <w:t xml:space="preserve">Handoff overreach</w:t>
-            </w:r>
-          </w:p>
-        </w:tc>
-        <w:tc>
-          <w:tcPr>
-            <w:tcW w:type="dxa" w:w="4360"/>
+              <w:t xml:space="preserve">mock_local</w:t>
+            </w:r>
+          </w:p>
+        </w:tc>
+        <w:tc>
+          <w:tcPr>
+            <w:tcW w:type="dxa" w:w="3400"/>
             <w:tcBorders>
               <w:top w:val="single" w:color="BBBBBB" w:sz="1"/>
               <w:left w:val="single" w:color="BBBBBB" w:sz="1"/>
@@ -1237,13 +1971,13 @@
           </w:tcPr>
           <w:p>
             <w:r>
-              <w:t xml:space="preserve">Transfert vers un agent non declare</w:t>
-            </w:r>
-          </w:p>
-        </w:tc>
-        <w:tc>
-          <w:tcPr>
-            <w:tcW w:type="dxa" w:w="2800"/>
+              <w:t xml:space="preserve">ProxyForge -&gt; lab mock sur le port declare</w:t>
+            </w:r>
+          </w:p>
+        </w:tc>
+        <w:tc>
+          <w:tcPr>
+            <w:tcW w:type="dxa" w:w="4260"/>
             <w:tcBorders>
               <w:top w:val="single" w:color="BBBBBB" w:sz="1"/>
               <w:left w:val="single" w:color="BBBBBB" w:sz="1"/>
@@ -1260,7 +1994,7 @@
           </w:tcPr>
           <w:p>
             <w:r>
-              <w:t xml:space="preserve">ASI07</w:t>
+              <w:t xml:space="preserve">vrai trafic HTTP observable, cycle de vie pilote par le ServerManager (start/stop/status/log)</w:t>
             </w:r>
           </w:p>
         </w:tc>
@@ -1268,7 +2002,7 @@
       <w:tr>
         <w:tc>
           <w:tcPr>
-            <w:tcW w:type="dxa" w:w="2200"/>
+            <w:tcW w:type="dxa" w:w="1700"/>
             <w:tcBorders>
               <w:top w:val="single" w:color="BBBBBB" w:sz="1"/>
               <w:left w:val="single" w:color="BBBBBB" w:sz="1"/>
@@ -1285,13 +2019,13 @@
           </w:tcPr>
           <w:p>
             <w:r>
-              <w:t xml:space="preserve">Tool misuse / code exec</w:t>
-            </w:r>
-          </w:p>
-        </w:tc>
-        <w:tc>
-          <w:tcPr>
-            <w:tcW w:type="dxa" w:w="4360"/>
+              <w:t xml:space="preserve">declared_url</w:t>
+            </w:r>
+          </w:p>
+        </w:tc>
+        <w:tc>
+          <w:tcPr>
+            <w:tcW w:type="dxa" w:w="3400"/>
             <w:tcBorders>
               <w:top w:val="single" w:color="BBBBBB" w:sz="1"/>
               <w:left w:val="single" w:color="BBBBBB" w:sz="1"/>
@@ -1308,13 +2042,13 @@
           </w:tcPr>
           <w:p>
             <w:r>
-              <w:t xml:space="preserve">Invocation d'un outil hors capability_scope</w:t>
-            </w:r>
-          </w:p>
-        </w:tc>
-        <w:tc>
-          <w:tcPr>
-            <w:tcW w:type="dxa" w:w="2800"/>
+              <w:t xml:space="preserve">ProxyForge -&gt; base_url fourni</w:t>
+            </w:r>
+          </w:p>
+        </w:tc>
+        <w:tc>
+          <w:tcPr>
+            <w:tcW w:type="dxa" w:w="4260"/>
             <w:tcBorders>
               <w:top w:val="single" w:color="BBBBBB" w:sz="1"/>
               <w:left w:val="single" w:color="BBBBBB" w:sz="1"/>
@@ -1331,7 +2065,7 @@
           </w:tcPr>
           <w:p>
             <w:r>
-              <w:t xml:space="preserve">ASI02 / ASI05</w:t>
+              <w:t xml:space="preserve">tout serveur parlant le contrat wire du lab</w:t>
             </w:r>
           </w:p>
         </w:tc>
@@ -1339,7 +2073,7 @@
       <w:tr>
         <w:tc>
           <w:tcPr>
-            <w:tcW w:type="dxa" w:w="2200"/>
+            <w:tcW w:type="dxa" w:w="1700"/>
             <w:tcBorders>
               <w:top w:val="single" w:color="BBBBBB" w:sz="1"/>
               <w:left w:val="single" w:color="BBBBBB" w:sz="1"/>
@@ -1356,13 +2090,13 @@
           </w:tcPr>
           <w:p>
             <w:r>
-              <w:t xml:space="preserve">Identity mismatch</w:t>
-            </w:r>
-          </w:p>
-        </w:tc>
-        <w:tc>
-          <w:tcPr>
-            <w:tcW w:type="dxa" w:w="4360"/>
+              <w:t xml:space="preserve">real_saas</w:t>
+            </w:r>
+          </w:p>
+        </w:tc>
+        <w:tc>
+          <w:tcPr>
+            <w:tcW w:type="dxa" w:w="3400"/>
             <w:tcBorders>
               <w:top w:val="single" w:color="BBBBBB" w:sz="1"/>
               <w:left w:val="single" w:color="BBBBBB" w:sz="1"/>
@@ -1379,13 +2113,13 @@
           </w:tcPr>
           <w:p>
             <w:r>
-              <w:t xml:space="preserve">Action sous une identite divergente</w:t>
-            </w:r>
-          </w:p>
-        </w:tc>
-        <w:tc>
-          <w:tcPr>
-            <w:tcW w:type="dxa" w:w="2800"/>
+              <w:t xml:space="preserve">aucune (pas encore de proxy)</w:t>
+            </w:r>
+          </w:p>
+        </w:tc>
+        <w:tc>
+          <w:tcPr>
+            <w:tcW w:type="dxa" w:w="4260"/>
             <w:tcBorders>
               <w:top w:val="single" w:color="BBBBBB" w:sz="1"/>
               <w:left w:val="single" w:color="BBBBBB" w:sz="1"/>
@@ -1402,149 +2136,7 @@
           </w:tcPr>
           <w:p>
             <w:r>
-              <w:t xml:space="preserve">ASI03</w:t>
-            </w:r>
-          </w:p>
-        </w:tc>
-      </w:tr>
-      <w:tr>
-        <w:tc>
-          <w:tcPr>
-            <w:tcW w:type="dxa" w:w="2200"/>
-            <w:tcBorders>
-              <w:top w:val="single" w:color="BBBBBB" w:sz="1"/>
-              <w:left w:val="single" w:color="BBBBBB" w:sz="1"/>
-              <w:bottom w:val="single" w:color="BBBBBB" w:sz="1"/>
-              <w:right w:val="single" w:color="BBBBBB" w:sz="1"/>
-            </w:tcBorders>
-            <w:shd w:fill="FFFFFF" w:val="clear"/>
-            <w:tcMar>
-              <w:top w:type="dxa" w:w="60"/>
-              <w:left w:type="dxa" w:w="110"/>
-              <w:bottom w:type="dxa" w:w="60"/>
-              <w:right w:type="dxa" w:w="110"/>
-            </w:tcMar>
-          </w:tcPr>
-          <w:p>
-            <w:r>
-              <w:t xml:space="preserve">Approval bypass</w:t>
-            </w:r>
-          </w:p>
-        </w:tc>
-        <w:tc>
-          <w:tcPr>
-            <w:tcW w:type="dxa" w:w="4360"/>
-            <w:tcBorders>
-              <w:top w:val="single" w:color="BBBBBB" w:sz="1"/>
-              <w:left w:val="single" w:color="BBBBBB" w:sz="1"/>
-              <w:bottom w:val="single" w:color="BBBBBB" w:sz="1"/>
-              <w:right w:val="single" w:color="BBBBBB" w:sz="1"/>
-            </w:tcBorders>
-            <w:shd w:fill="FFFFFF" w:val="clear"/>
-            <w:tcMar>
-              <w:top w:type="dxa" w:w="60"/>
-              <w:left w:type="dxa" w:w="110"/>
-              <w:bottom w:type="dxa" w:w="60"/>
-              <w:right w:type="dxa" w:w="110"/>
-            </w:tcMar>
-          </w:tcPr>
-          <w:p>
-            <w:r>
-              <w:t xml:space="preserve">Action sensible sans approbation</w:t>
-            </w:r>
-          </w:p>
-        </w:tc>
-        <w:tc>
-          <w:tcPr>
-            <w:tcW w:type="dxa" w:w="2800"/>
-            <w:tcBorders>
-              <w:top w:val="single" w:color="BBBBBB" w:sz="1"/>
-              <w:left w:val="single" w:color="BBBBBB" w:sz="1"/>
-              <w:bottom w:val="single" w:color="BBBBBB" w:sz="1"/>
-              <w:right w:val="single" w:color="BBBBBB" w:sz="1"/>
-            </w:tcBorders>
-            <w:shd w:fill="FFFFFF" w:val="clear"/>
-            <w:tcMar>
-              <w:top w:type="dxa" w:w="60"/>
-              <w:left w:type="dxa" w:w="110"/>
-              <w:bottom w:type="dxa" w:w="60"/>
-              <w:right w:type="dxa" w:w="110"/>
-            </w:tcMar>
-          </w:tcPr>
-          <w:p>
-            <w:r>
-              <w:t xml:space="preserve">ASI09</w:t>
-            </w:r>
-          </w:p>
-        </w:tc>
-      </w:tr>
-      <w:tr>
-        <w:tc>
-          <w:tcPr>
-            <w:tcW w:type="dxa" w:w="2200"/>
-            <w:tcBorders>
-              <w:top w:val="single" w:color="BBBBBB" w:sz="1"/>
-              <w:left w:val="single" w:color="BBBBBB" w:sz="1"/>
-              <w:bottom w:val="single" w:color="BBBBBB" w:sz="1"/>
-              <w:right w:val="single" w:color="BBBBBB" w:sz="1"/>
-            </w:tcBorders>
-            <w:shd w:fill="EEF1F7" w:val="clear"/>
-            <w:tcMar>
-              <w:top w:type="dxa" w:w="60"/>
-              <w:left w:type="dxa" w:w="110"/>
-              <w:bottom w:type="dxa" w:w="60"/>
-              <w:right w:type="dxa" w:w="110"/>
-            </w:tcMar>
-          </w:tcPr>
-          <w:p>
-            <w:r>
-              <w:t xml:space="preserve">Crescendo coercion</w:t>
-            </w:r>
-          </w:p>
-        </w:tc>
-        <w:tc>
-          <w:tcPr>
-            <w:tcW w:type="dxa" w:w="4360"/>
-            <w:tcBorders>
-              <w:top w:val="single" w:color="BBBBBB" w:sz="1"/>
-              <w:left w:val="single" w:color="BBBBBB" w:sz="1"/>
-              <w:bottom w:val="single" w:color="BBBBBB" w:sz="1"/>
-              <w:right w:val="single" w:color="BBBBBB" w:sz="1"/>
-            </w:tcBorders>
-            <w:shd w:fill="EEF1F7" w:val="clear"/>
-            <w:tcMar>
-              <w:top w:type="dxa" w:w="60"/>
-              <w:left w:type="dxa" w:w="110"/>
-              <w:bottom w:type="dxa" w:w="60"/>
-              <w:right w:type="dxa" w:w="110"/>
-            </w:tcMar>
-          </w:tcPr>
-          <w:p>
-            <w:r>
-              <w:t xml:space="preserve">4 phases d'escalade (rapport, sondage, autorite, pression)</w:t>
-            </w:r>
-          </w:p>
-        </w:tc>
-        <w:tc>
-          <w:tcPr>
-            <w:tcW w:type="dxa" w:w="2800"/>
-            <w:tcBorders>
-              <w:top w:val="single" w:color="BBBBBB" w:sz="1"/>
-              <w:left w:val="single" w:color="BBBBBB" w:sz="1"/>
-              <w:bottom w:val="single" w:color="BBBBBB" w:sz="1"/>
-              <w:right w:val="single" w:color="BBBBBB" w:sz="1"/>
-            </w:tcBorders>
-            <w:shd w:fill="EEF1F7" w:val="clear"/>
-            <w:tcMar>
-              <w:top w:type="dxa" w:w="60"/>
-              <w:left w:type="dxa" w:w="110"/>
-              <w:bottom w:type="dxa" w:w="60"/>
-              <w:right w:type="dxa" w:w="110"/>
-            </w:tcMar>
-          </w:tcPr>
-          <w:p>
-            <w:r>
-              <w:t xml:space="preserve">ASI01</w:t>
+              <w:t xml:space="preserve">ValueError -&gt; le run ECHOUE, jamais de repli silencieux (I5)</w:t>
             </w:r>
           </w:p>
         </w:tc>
@@ -1552,26 +2144,60 @@
     </w:tbl>
     <w:p>
       <w:pPr>
-        <w:pStyle w:val="Heading2"/>
-      </w:pPr>
-      <w:r>
-        <w:t xml:space="preserve">3.3 D'ou la necessite d'un controle deterministe</w:t>
-      </w:r>
-    </w:p>
-    <w:p>
-      <w:pPr>
         <w:spacing w:after="120"/>
       </w:pPr>
       <w:r>
-        <w:t xml:space="preserve">La decision de gouvernance est une fonction pure : decide(event, policy_version, catalog) -&gt; allow | deny | escalate. Aucune horloge, aucun random, aucune I/O dans le chemin de decision (I4). Consequence : meme stream d'evenements + meme version de policy =&gt; meme verdict, byte-identique. On peut rejouer n'importe quelle decision passee pour audit forensique, sur un event store append-only hash-chaine (I1).</w:t>
-      </w:r>
-    </w:p>
-    <w:p>
-      <w:pPr>
-        <w:pStyle w:val="Heading2"/>
-      </w:pPr>
-      <w:r>
-        <w:t xml:space="preserve">3.4 Passeport crypto : gouverner seulement apres decouverte</w:t>
+        <w:rPr>
+          <w:b/>
+          <w:bCs/>
+        </w:rPr>
+        <w:t xml:space="preserve">Contrat wire</w:t>
+      </w:r>
+      <w:r>
+        <w:t xml:space="preserve"> commun : `POST /{target_system}/execute`, enveloppe `{success, data | error}`. </w:t>
+      </w:r>
+      <w:r>
+        <w:rPr>
+          <w:b/>
+          <w:bCs/>
+        </w:rPr>
+        <w:t xml:space="preserve">16 doubles deterministes</w:t>
+      </w:r>
+      <w:r>
+        <w:t xml:space="preserve"> (champs metier par action, 422 si invalide, ids = sha256 des entrees, pas d'horloge/random -- I4). </w:t>
+      </w:r>
+      <w:r>
+        <w:rPr>
+          <w:b/>
+          <w:bCs/>
+        </w:rPr>
+        <w:t xml:space="preserve">Access log JSONL</w:t>
+      </w:r>
+      <w:r>
+        <w:t xml:space="preserve"> cote serveur (`{event_id, target_system, action_type, resource, status}` par requete) : la matiere brute qu'un collecteur discovery consommerait. Un </w:t>
+      </w:r>
+      <w:r>
+        <w:rPr>
+          <w:b/>
+          <w:bCs/>
+        </w:rPr>
+        <w:t xml:space="preserve">honeypot</w:t>
+      </w:r>
+      <w:r>
+        <w:t xml:space="preserve"> (`shadow_db`, :9113) complete les 12 mock_local.</w:t>
+      </w:r>
+    </w:p>
+    <w:p>
+      <w:r>
+        <w:br w:type="page"/>
+      </w:r>
+    </w:p>
+    <w:p>
+      <w:pPr>
+        <w:pStyle w:val="Heading1"/>
+      </w:pPr>
+      <w:r>
+        <w:t xml:space="preserve">5. Le proxy : rendre l'echange lisible (I5)</w:t>
       </w:r>
     </w:p>
     <w:p>
@@ -1579,7 +2205,45 @@
         <w:spacing w:after="120"/>
       </w:pPr>
       <w:r>
-        <w:t xml:space="preserve">On ne gouverne que ce qu'on a d'abord cartographie. La discovery scanne la source (repo + manifest), etablit l'existence et le perimetre declare d'un agent. Un agent decouvert recoit un passeport : une liaison cryptographique a une identite (principal / auth_method, invariant I3). Toute action doit etre liee a cette identite ; une action anonyme ou a l'identite divergente est rejetee. Pas de passeport, pas d'action.</w:t>
+        <w:t xml:space="preserve">Tout effet de bord passe par un `ExternalSystemProxy` qui produit un `side_effect_hash` deterministe et n'a </w:t>
+      </w:r>
+      <w:r>
+        <w:rPr>
+          <w:b/>
+          <w:bCs/>
+        </w:rPr>
+        <w:t xml:space="preserve">jamais</w:t>
+      </w:r>
+      <w:r>
+        <w:t xml:space="preserve"> de chemin de contournement (echec -&gt; erreur auditable, pas de fallback). Le `TracingProxy` enregistre chaque execution en </w:t>
+      </w:r>
+      <w:r>
+        <w:rPr>
+          <w:b/>
+          <w:bCs/>
+        </w:rPr>
+        <w:t xml:space="preserve">ProxyTrace</w:t>
+      </w:r>
+      <w:r>
+        <w:t xml:space="preserve"> : la requete (`action_type` + `resource` + `request_payload`) ET la `response` du serveur, avec status, hash et `seq` monotone, dans un ring buffer borne -- surface dans le log reseau du cockpit.</w:t>
+      </w:r>
+    </w:p>
+    <w:p>
+      <w:pPr>
+        <w:spacing w:after="120"/>
+      </w:pPr>
+      <w:r>
+        <w:t xml:space="preserve">C'est la couche qui rend lisible </w:t>
+      </w:r>
+      <w:r>
+        <w:rPr>
+          <w:b/>
+          <w:bCs/>
+        </w:rPr>
+        <w:t xml:space="preserve">ce que l'agent FAIT vraiment</w:t>
+      </w:r>
+      <w:r>
+        <w:t xml:space="preserve">. Un overlay wire optionnel (mitmproxy) capture en plus les octets sur le fil (`x-inspect-run-id` correle le flux au run). Les trois surfaces -- hook (ProxyTrace), wire, et la sonde eBPF (section 6) -- alimentent le meme scorecard de detection.</w:t>
       </w:r>
     </w:p>
     <w:p>
@@ -1590,9 +2254,9 @@
       <w:r>
         <w:drawing>
           <wp:inline distT="0" distB="0" distL="0" distR="0">
-            <wp:extent cx="5905500" cy="3209925"/>
+            <wp:extent cx="5905500" cy="3429000"/>
             <wp:effectExtent t="0" r="0" b="0" l="0"/>
-            <wp:docPr id="1" name="05_three_surfaces" descr="Figure 3 -- Trois surfaces d'observation : declare (source), reel (runtime/reseau), continu (audit)" title="Figure 3 -- Trois surfaces d'observation : declare (source), reel (runtime/reseau), continu (audit)"/>
+            <wp:docPr id="1" name="07_laneb_sequence" descr="Figure 3 -- Boucle decide -&gt; act pilotee par SKYNET ; chaque action est tracee et enregistree" title="Figure 3 -- Boucle decide -&gt; act pilotee par SKYNET ; chaque action est tracee et enregistree"/>
             <wp:cNvGraphicFramePr>
               <a:graphicFrameLocks xmlns:a="http://schemas.openxmlformats.org/drawingml/2006/main" noChangeAspect="1"/>
             </wp:cNvGraphicFramePr>
@@ -1615,7 +2279,7 @@
                   <pic:spPr bwMode="auto">
                     <a:xfrm>
                       <a:off x="0" y="0"/>
-                      <a:ext cx="5905500" cy="3209925"/>
+                      <a:ext cx="5905500" cy="3429000"/>
                     </a:xfrm>
                     <a:prstGeom prst="rect">
                       <a:avLst/>
@@ -1641,15 +2305,20 @@
           <w:sz w:val="18"/>
           <w:szCs w:val="18"/>
         </w:rPr>
-        <w:t xml:space="preserve">Figure 3 -- Trois surfaces d'observation : declare (source), reel (runtime/reseau), continu (audit)</w:t>
-      </w:r>
-    </w:p>
-    <w:p>
-      <w:pPr>
-        <w:pStyle w:val="Heading2"/>
-      </w:pPr>
-      <w:r>
-        <w:t xml:space="preserve">3.5 Creer des regles de controle d'activite</w:t>
+        <w:t xml:space="preserve">Figure 3 -- Boucle decide -&gt; act pilotee par SKYNET ; chaque action est tracee et enregistree</w:t>
+      </w:r>
+    </w:p>
+    <w:p>
+      <w:r>
+        <w:br w:type="page"/>
+      </w:r>
+    </w:p>
+    <w:p>
+      <w:pPr>
+        <w:pStyle w:val="Heading1"/>
+      </w:pPr>
+      <w:r>
+        <w:t xml:space="preserve">6. Discovery : la sonde Rust eBPF (discoveryprobe)</w:t>
       </w:r>
     </w:p>
     <w:p>
@@ -1657,7 +2326,27 @@
         <w:spacing w:after="120"/>
       </w:pPr>
       <w:r>
-        <w:t xml:space="preserve">Le controle est exprime, pas code en dur : un catalogue de 148 actions (16 systemes), chacune avec un risk_level et une criticite Annex C (C1 refus par defaut, C2 escalade, C3 conditionnel, C4 autorise+journalise) ; des policies versionnees par (target_system, action_type, role) en deny-by-default ; une escalade bloquante (I6).</w:t>
+        <w:t xml:space="preserve">These fondatrice : </w:t>
+      </w:r>
+      <w:r>
+        <w:rPr>
+          <w:b/>
+          <w:bCs/>
+        </w:rPr>
+        <w:t xml:space="preserve">si l'outil ne voit pas les agents, c'est un echec.</w:t>
+      </w:r>
+      <w:r>
+        <w:t xml:space="preserve"> `discoveryprobe` la rend mesurable en conditions reelles -- une </w:t>
+      </w:r>
+      <w:r>
+        <w:rPr>
+          <w:b/>
+          <w:bCs/>
+        </w:rPr>
+        <w:t xml:space="preserve">sonde native eBPF en Rust + aya</w:t>
+      </w:r>
+      <w:r>
+        <w:t xml:space="preserve"> qui observe pour de vrai des agents vivants (ceux servis par SKYNET) au niveau du noyau.</w:t>
       </w:r>
     </w:p>
     <w:p>
@@ -1668,9 +2357,9 @@
       <w:r>
         <w:drawing>
           <wp:inline distT="0" distB="0" distL="0" distR="0">
-            <wp:extent cx="5905500" cy="2200275"/>
+            <wp:extent cx="5905500" cy="1533525"/>
             <wp:effectExtent t="0" r="0" b="0" l="0"/>
-            <wp:docPr id="1" name="06_four_dimensions" descr="Figure 4 -- Un agent est juge sur 4 dimensions : identite, capacites, policy, comportement" title="Figure 4 -- Un agent est juge sur 4 dimensions : identite, capacites, policy, comportement"/>
+            <wp:docPr id="1" name="08_discoveryprobe" descr="Figure 4 -- discoveryprobe : sonde Rust eBPF, surfaces noyau -&gt; meme DetectionScorecard" title="Figure 4 -- discoveryprobe : sonde Rust eBPF, surfaces noyau -&gt; meme DetectionScorecard"/>
             <wp:cNvGraphicFramePr>
               <a:graphicFrameLocks xmlns:a="http://schemas.openxmlformats.org/drawingml/2006/main" noChangeAspect="1"/>
             </wp:cNvGraphicFramePr>
@@ -1693,7 +2382,7 @@
                   <pic:spPr bwMode="auto">
                     <a:xfrm>
                       <a:off x="0" y="0"/>
-                      <a:ext cx="5905500" cy="2200275"/>
+                      <a:ext cx="5905500" cy="1533525"/>
                     </a:xfrm>
                     <a:prstGeom prst="rect">
                       <a:avLst/>
@@ -1719,7 +2408,540 @@
           <w:sz w:val="18"/>
           <w:szCs w:val="18"/>
         </w:rPr>
-        <w:t xml:space="preserve">Figure 4 -- Un agent est juge sur 4 dimensions : identite, capacites, policy, comportement</w:t>
+        <w:t xml:space="preserve">Figure 4 -- discoveryprobe : sonde Rust eBPF, surfaces noyau -&gt; meme DetectionScorecard</w:t>
+      </w:r>
+    </w:p>
+    <w:tbl>
+      <w:tblPr>
+        <w:tblW w:type="dxa" w:w="9360"/>
+        <w:tblBorders>
+          <w:top w:val="single" w:color="auto" w:sz="4"/>
+          <w:left w:val="single" w:color="auto" w:sz="4"/>
+          <w:bottom w:val="single" w:color="auto" w:sz="4"/>
+          <w:right w:val="single" w:color="auto" w:sz="4"/>
+          <w:insideH w:val="single" w:color="auto" w:sz="4"/>
+          <w:insideV w:val="single" w:color="auto" w:sz="4"/>
+        </w:tblBorders>
+      </w:tblPr>
+      <w:tblGrid>
+        <w:gridCol w:w="2700"/>
+        <w:gridCol w:w="2600"/>
+        <w:gridCol w:w="4060"/>
+      </w:tblGrid>
+      <w:tr>
+        <w:trPr>
+          <w:tblHeader/>
+        </w:trPr>
+        <w:tc>
+          <w:tcPr>
+            <w:tcW w:type="dxa" w:w="2700"/>
+            <w:tcBorders>
+              <w:top w:val="single" w:color="BBBBBB" w:sz="1"/>
+              <w:left w:val="single" w:color="BBBBBB" w:sz="1"/>
+              <w:bottom w:val="single" w:color="BBBBBB" w:sz="1"/>
+              <w:right w:val="single" w:color="BBBBBB" w:sz="1"/>
+            </w:tcBorders>
+            <w:shd w:fill="1F3864" w:val="clear"/>
+            <w:tcMar>
+              <w:top w:type="dxa" w:w="60"/>
+              <w:left w:type="dxa" w:w="110"/>
+              <w:bottom w:type="dxa" w:w="60"/>
+              <w:right w:type="dxa" w:w="110"/>
+            </w:tcMar>
+          </w:tcPr>
+          <w:p>
+            <w:r>
+              <w:rPr>
+                <w:b/>
+                <w:bCs/>
+                <w:color w:val="FFFFFF"/>
+                <w:sz w:val="19"/>
+                <w:szCs w:val="19"/>
+              </w:rPr>
+              <w:t xml:space="preserve">Tracepoint</w:t>
+            </w:r>
+          </w:p>
+        </w:tc>
+        <w:tc>
+          <w:tcPr>
+            <w:tcW w:type="dxa" w:w="2600"/>
+            <w:tcBorders>
+              <w:top w:val="single" w:color="BBBBBB" w:sz="1"/>
+              <w:left w:val="single" w:color="BBBBBB" w:sz="1"/>
+              <w:bottom w:val="single" w:color="BBBBBB" w:sz="1"/>
+              <w:right w:val="single" w:color="BBBBBB" w:sz="1"/>
+            </w:tcBorders>
+            <w:shd w:fill="1F3864" w:val="clear"/>
+            <w:tcMar>
+              <w:top w:type="dxa" w:w="60"/>
+              <w:left w:type="dxa" w:w="110"/>
+              <w:bottom w:type="dxa" w:w="60"/>
+              <w:right w:type="dxa" w:w="110"/>
+            </w:tcMar>
+          </w:tcPr>
+          <w:p>
+            <w:r>
+              <w:rPr>
+                <w:b/>
+                <w:bCs/>
+                <w:color w:val="FFFFFF"/>
+                <w:sz w:val="19"/>
+                <w:szCs w:val="19"/>
+              </w:rPr>
+              <w:t xml:space="preserve">Token</w:t>
+            </w:r>
+          </w:p>
+        </w:tc>
+        <w:tc>
+          <w:tcPr>
+            <w:tcW w:type="dxa" w:w="4060"/>
+            <w:tcBorders>
+              <w:top w:val="single" w:color="BBBBBB" w:sz="1"/>
+              <w:left w:val="single" w:color="BBBBBB" w:sz="1"/>
+              <w:bottom w:val="single" w:color="BBBBBB" w:sz="1"/>
+              <w:right w:val="single" w:color="BBBBBB" w:sz="1"/>
+            </w:tcBorders>
+            <w:shd w:fill="1F3864" w:val="clear"/>
+            <w:tcMar>
+              <w:top w:type="dxa" w:w="60"/>
+              <w:left w:type="dxa" w:w="110"/>
+              <w:bottom w:type="dxa" w:w="60"/>
+              <w:right w:type="dxa" w:w="110"/>
+            </w:tcMar>
+          </w:tcPr>
+          <w:p>
+            <w:r>
+              <w:rPr>
+                <w:b/>
+                <w:bCs/>
+                <w:color w:val="FFFFFF"/>
+                <w:sz w:val="19"/>
+                <w:szCs w:val="19"/>
+              </w:rPr>
+              <w:t xml:space="preserve">Signification</w:t>
+            </w:r>
+          </w:p>
+        </w:tc>
+      </w:tr>
+      <w:tr>
+        <w:tc>
+          <w:tcPr>
+            <w:tcW w:type="dxa" w:w="2700"/>
+            <w:tcBorders>
+              <w:top w:val="single" w:color="BBBBBB" w:sz="1"/>
+              <w:left w:val="single" w:color="BBBBBB" w:sz="1"/>
+              <w:bottom w:val="single" w:color="BBBBBB" w:sz="1"/>
+              <w:right w:val="single" w:color="BBBBBB" w:sz="1"/>
+            </w:tcBorders>
+            <w:shd w:fill="FFFFFF" w:val="clear"/>
+            <w:tcMar>
+              <w:top w:type="dxa" w:w="60"/>
+              <w:left w:type="dxa" w:w="110"/>
+              <w:bottom w:type="dxa" w:w="60"/>
+              <w:right w:type="dxa" w:w="110"/>
+            </w:tcMar>
+          </w:tcPr>
+          <w:p>
+            <w:r>
+              <w:t xml:space="preserve">sched_process_exec</w:t>
+            </w:r>
+          </w:p>
+        </w:tc>
+        <w:tc>
+          <w:tcPr>
+            <w:tcW w:type="dxa" w:w="2600"/>
+            <w:tcBorders>
+              <w:top w:val="single" w:color="BBBBBB" w:sz="1"/>
+              <w:left w:val="single" w:color="BBBBBB" w:sz="1"/>
+              <w:bottom w:val="single" w:color="BBBBBB" w:sz="1"/>
+              <w:right w:val="single" w:color="BBBBBB" w:sz="1"/>
+            </w:tcBorders>
+            <w:shd w:fill="FFFFFF" w:val="clear"/>
+            <w:tcMar>
+              <w:top w:type="dxa" w:w="60"/>
+              <w:left w:type="dxa" w:w="110"/>
+              <w:bottom w:type="dxa" w:w="60"/>
+              <w:right w:type="dxa" w:w="110"/>
+            </w:tcMar>
+          </w:tcPr>
+          <w:p>
+            <w:r>
+              <w:t xml:space="preserve">exec:{comm}:{pid}</w:t>
+            </w:r>
+          </w:p>
+        </w:tc>
+        <w:tc>
+          <w:tcPr>
+            <w:tcW w:type="dxa" w:w="4060"/>
+            <w:tcBorders>
+              <w:top w:val="single" w:color="BBBBBB" w:sz="1"/>
+              <w:left w:val="single" w:color="BBBBBB" w:sz="1"/>
+              <w:bottom w:val="single" w:color="BBBBBB" w:sz="1"/>
+              <w:right w:val="single" w:color="BBBBBB" w:sz="1"/>
+            </w:tcBorders>
+            <w:shd w:fill="FFFFFF" w:val="clear"/>
+            <w:tcMar>
+              <w:top w:type="dxa" w:w="60"/>
+              <w:left w:type="dxa" w:w="110"/>
+              <w:bottom w:type="dxa" w:w="60"/>
+              <w:right w:type="dxa" w:w="110"/>
+            </w:tcMar>
+          </w:tcPr>
+          <w:p>
+            <w:r>
+              <w:t xml:space="preserve">le process agent a tourne</w:t>
+            </w:r>
+          </w:p>
+        </w:tc>
+      </w:tr>
+      <w:tr>
+        <w:tc>
+          <w:tcPr>
+            <w:tcW w:type="dxa" w:w="2700"/>
+            <w:tcBorders>
+              <w:top w:val="single" w:color="BBBBBB" w:sz="1"/>
+              <w:left w:val="single" w:color="BBBBBB" w:sz="1"/>
+              <w:bottom w:val="single" w:color="BBBBBB" w:sz="1"/>
+              <w:right w:val="single" w:color="BBBBBB" w:sz="1"/>
+            </w:tcBorders>
+            <w:shd w:fill="EEF1F7" w:val="clear"/>
+            <w:tcMar>
+              <w:top w:type="dxa" w:w="60"/>
+              <w:left w:type="dxa" w:w="110"/>
+              <w:bottom w:type="dxa" w:w="60"/>
+              <w:right w:type="dxa" w:w="110"/>
+            </w:tcMar>
+          </w:tcPr>
+          <w:p>
+            <w:r>
+              <w:t xml:space="preserve">sys_enter_connect</w:t>
+            </w:r>
+          </w:p>
+        </w:tc>
+        <w:tc>
+          <w:tcPr>
+            <w:tcW w:type="dxa" w:w="2600"/>
+            <w:tcBorders>
+              <w:top w:val="single" w:color="BBBBBB" w:sz="1"/>
+              <w:left w:val="single" w:color="BBBBBB" w:sz="1"/>
+              <w:bottom w:val="single" w:color="BBBBBB" w:sz="1"/>
+              <w:right w:val="single" w:color="BBBBBB" w:sz="1"/>
+            </w:tcBorders>
+            <w:shd w:fill="EEF1F7" w:val="clear"/>
+            <w:tcMar>
+              <w:top w:type="dxa" w:w="60"/>
+              <w:left w:type="dxa" w:w="110"/>
+              <w:bottom w:type="dxa" w:w="60"/>
+              <w:right w:type="dxa" w:w="110"/>
+            </w:tcMar>
+          </w:tcPr>
+          <w:p>
+            <w:r>
+              <w:t xml:space="preserve">connect:{ip}:{port}</w:t>
+            </w:r>
+          </w:p>
+        </w:tc>
+        <w:tc>
+          <w:tcPr>
+            <w:tcW w:type="dxa" w:w="4060"/>
+            <w:tcBorders>
+              <w:top w:val="single" w:color="BBBBBB" w:sz="1"/>
+              <w:left w:val="single" w:color="BBBBBB" w:sz="1"/>
+              <w:bottom w:val="single" w:color="BBBBBB" w:sz="1"/>
+              <w:right w:val="single" w:color="BBBBBB" w:sz="1"/>
+            </w:tcBorders>
+            <w:shd w:fill="EEF1F7" w:val="clear"/>
+            <w:tcMar>
+              <w:top w:type="dxa" w:w="60"/>
+              <w:left w:type="dxa" w:w="110"/>
+              <w:bottom w:type="dxa" w:w="60"/>
+              <w:right w:type="dxa" w:w="110"/>
+            </w:tcMar>
+          </w:tcPr>
+          <w:p>
+            <w:r>
+              <w:t xml:space="preserve">egress TCP (host declare ou ghost non declare)</w:t>
+            </w:r>
+          </w:p>
+        </w:tc>
+      </w:tr>
+      <w:tr>
+        <w:tc>
+          <w:tcPr>
+            <w:tcW w:type="dxa" w:w="2700"/>
+            <w:tcBorders>
+              <w:top w:val="single" w:color="BBBBBB" w:sz="1"/>
+              <w:left w:val="single" w:color="BBBBBB" w:sz="1"/>
+              <w:bottom w:val="single" w:color="BBBBBB" w:sz="1"/>
+              <w:right w:val="single" w:color="BBBBBB" w:sz="1"/>
+            </w:tcBorders>
+            <w:shd w:fill="FFFFFF" w:val="clear"/>
+            <w:tcMar>
+              <w:top w:type="dxa" w:w="60"/>
+              <w:left w:type="dxa" w:w="110"/>
+              <w:bottom w:type="dxa" w:w="60"/>
+              <w:right w:type="dxa" w:w="110"/>
+            </w:tcMar>
+          </w:tcPr>
+          <w:p>
+            <w:r>
+              <w:t xml:space="preserve">sys_enter_sendto :53</w:t>
+            </w:r>
+          </w:p>
+        </w:tc>
+        <w:tc>
+          <w:tcPr>
+            <w:tcW w:type="dxa" w:w="2600"/>
+            <w:tcBorders>
+              <w:top w:val="single" w:color="BBBBBB" w:sz="1"/>
+              <w:left w:val="single" w:color="BBBBBB" w:sz="1"/>
+              <w:bottom w:val="single" w:color="BBBBBB" w:sz="1"/>
+              <w:right w:val="single" w:color="BBBBBB" w:sz="1"/>
+            </w:tcBorders>
+            <w:shd w:fill="FFFFFF" w:val="clear"/>
+            <w:tcMar>
+              <w:top w:type="dxa" w:w="60"/>
+              <w:left w:type="dxa" w:w="110"/>
+              <w:bottom w:type="dxa" w:w="60"/>
+              <w:right w:type="dxa" w:w="110"/>
+            </w:tcMar>
+          </w:tcPr>
+          <w:p>
+            <w:r>
+              <w:t xml:space="preserve">dns:{qname}</w:t>
+            </w:r>
+          </w:p>
+        </w:tc>
+        <w:tc>
+          <w:tcPr>
+            <w:tcW w:type="dxa" w:w="4060"/>
+            <w:tcBorders>
+              <w:top w:val="single" w:color="BBBBBB" w:sz="1"/>
+              <w:left w:val="single" w:color="BBBBBB" w:sz="1"/>
+              <w:bottom w:val="single" w:color="BBBBBB" w:sz="1"/>
+              <w:right w:val="single" w:color="BBBBBB" w:sz="1"/>
+            </w:tcBorders>
+            <w:shd w:fill="FFFFFF" w:val="clear"/>
+            <w:tcMar>
+              <w:top w:type="dxa" w:w="60"/>
+              <w:left w:type="dxa" w:w="110"/>
+              <w:bottom w:type="dxa" w:w="60"/>
+              <w:right w:type="dxa" w:w="110"/>
+            </w:tcMar>
+          </w:tcPr>
+          <w:p>
+            <w:r>
+              <w:t xml:space="preserve">un nom DNS resolu par l'agent</w:t>
+            </w:r>
+          </w:p>
+        </w:tc>
+      </w:tr>
+      <w:tr>
+        <w:tc>
+          <w:tcPr>
+            <w:tcW w:type="dxa" w:w="2700"/>
+            <w:tcBorders>
+              <w:top w:val="single" w:color="BBBBBB" w:sz="1"/>
+              <w:left w:val="single" w:color="BBBBBB" w:sz="1"/>
+              <w:bottom w:val="single" w:color="BBBBBB" w:sz="1"/>
+              <w:right w:val="single" w:color="BBBBBB" w:sz="1"/>
+            </w:tcBorders>
+            <w:shd w:fill="EEF1F7" w:val="clear"/>
+            <w:tcMar>
+              <w:top w:type="dxa" w:w="60"/>
+              <w:left w:type="dxa" w:w="110"/>
+              <w:bottom w:type="dxa" w:w="60"/>
+              <w:right w:type="dxa" w:w="110"/>
+            </w:tcMar>
+          </w:tcPr>
+          <w:p>
+            <w:r>
+              <w:t xml:space="preserve">sys_enter_openat</w:t>
+            </w:r>
+          </w:p>
+        </w:tc>
+        <w:tc>
+          <w:tcPr>
+            <w:tcW w:type="dxa" w:w="2600"/>
+            <w:tcBorders>
+              <w:top w:val="single" w:color="BBBBBB" w:sz="1"/>
+              <w:left w:val="single" w:color="BBBBBB" w:sz="1"/>
+              <w:bottom w:val="single" w:color="BBBBBB" w:sz="1"/>
+              <w:right w:val="single" w:color="BBBBBB" w:sz="1"/>
+            </w:tcBorders>
+            <w:shd w:fill="EEF1F7" w:val="clear"/>
+            <w:tcMar>
+              <w:top w:type="dxa" w:w="60"/>
+              <w:left w:type="dxa" w:w="110"/>
+              <w:bottom w:type="dxa" w:w="60"/>
+              <w:right w:type="dxa" w:w="110"/>
+            </w:tcMar>
+          </w:tcPr>
+          <w:p>
+            <w:r>
+              <w:t xml:space="preserve">open:{path}</w:t>
+            </w:r>
+          </w:p>
+        </w:tc>
+        <w:tc>
+          <w:tcPr>
+            <w:tcW w:type="dxa" w:w="4060"/>
+            <w:tcBorders>
+              <w:top w:val="single" w:color="BBBBBB" w:sz="1"/>
+              <w:left w:val="single" w:color="BBBBBB" w:sz="1"/>
+              <w:bottom w:val="single" w:color="BBBBBB" w:sz="1"/>
+              <w:right w:val="single" w:color="BBBBBB" w:sz="1"/>
+            </w:tcBorders>
+            <w:shd w:fill="EEF1F7" w:val="clear"/>
+            <w:tcMar>
+              <w:top w:type="dxa" w:w="60"/>
+              <w:left w:type="dxa" w:w="110"/>
+              <w:bottom w:type="dxa" w:w="60"/>
+              <w:right w:type="dxa" w:w="110"/>
+            </w:tcMar>
+          </w:tcPr>
+          <w:p>
+            <w:r>
+              <w:t xml:space="preserve">un fichier ouvert (surface data-access)</w:t>
+            </w:r>
+          </w:p>
+        </w:tc>
+      </w:tr>
+      <w:tr>
+        <w:tc>
+          <w:tcPr>
+            <w:tcW w:type="dxa" w:w="2700"/>
+            <w:tcBorders>
+              <w:top w:val="single" w:color="BBBBBB" w:sz="1"/>
+              <w:left w:val="single" w:color="BBBBBB" w:sz="1"/>
+              <w:bottom w:val="single" w:color="BBBBBB" w:sz="1"/>
+              <w:right w:val="single" w:color="BBBBBB" w:sz="1"/>
+            </w:tcBorders>
+            <w:shd w:fill="FFFFFF" w:val="clear"/>
+            <w:tcMar>
+              <w:top w:type="dxa" w:w="60"/>
+              <w:left w:type="dxa" w:w="110"/>
+              <w:bottom w:type="dxa" w:w="60"/>
+              <w:right w:type="dxa" w:w="110"/>
+            </w:tcMar>
+          </w:tcPr>
+          <w:p>
+            <w:r>
+              <w:t xml:space="preserve">sched_process_fork</w:t>
+            </w:r>
+          </w:p>
+        </w:tc>
+        <w:tc>
+          <w:tcPr>
+            <w:tcW w:type="dxa" w:w="2600"/>
+            <w:tcBorders>
+              <w:top w:val="single" w:color="BBBBBB" w:sz="1"/>
+              <w:left w:val="single" w:color="BBBBBB" w:sz="1"/>
+              <w:bottom w:val="single" w:color="BBBBBB" w:sz="1"/>
+              <w:right w:val="single" w:color="BBBBBB" w:sz="1"/>
+            </w:tcBorders>
+            <w:shd w:fill="FFFFFF" w:val="clear"/>
+            <w:tcMar>
+              <w:top w:type="dxa" w:w="60"/>
+              <w:left w:type="dxa" w:w="110"/>
+              <w:bottom w:type="dxa" w:w="60"/>
+              <w:right w:type="dxa" w:w="110"/>
+            </w:tcMar>
+          </w:tcPr>
+          <w:p>
+            <w:r>
+              <w:t xml:space="preserve">(edge)</w:t>
+            </w:r>
+          </w:p>
+        </w:tc>
+        <w:tc>
+          <w:tcPr>
+            <w:tcW w:type="dxa" w:w="4060"/>
+            <w:tcBorders>
+              <w:top w:val="single" w:color="BBBBBB" w:sz="1"/>
+              <w:left w:val="single" w:color="BBBBBB" w:sz="1"/>
+              <w:bottom w:val="single" w:color="BBBBBB" w:sz="1"/>
+              <w:right w:val="single" w:color="BBBBBB" w:sz="1"/>
+            </w:tcBorders>
+            <w:shd w:fill="FFFFFF" w:val="clear"/>
+            <w:tcMar>
+              <w:top w:type="dxa" w:w="60"/>
+              <w:left w:type="dxa" w:w="110"/>
+              <w:bottom w:type="dxa" w:w="60"/>
+              <w:right w:type="dxa" w:w="110"/>
+            </w:tcMar>
+          </w:tcPr>
+          <w:p>
+            <w:r>
+              <w:t xml:space="preserve">un process enfant attribue a l'agent parent (ppid)</w:t>
+            </w:r>
+          </w:p>
+        </w:tc>
+      </w:tr>
+    </w:tbl>
+    <w:p>
+      <w:pPr>
+        <w:spacing w:after="120"/>
+      </w:pPr>
+      <w:r>
+        <w:rPr>
+          <w:b/>
+          <w:bCs/>
+        </w:rPr>
+        <w:t xml:space="preserve">Priv-separation</w:t>
+      </w:r>
+      <w:r>
+        <w:t xml:space="preserve"> : un broker dedie est le seul a porter </w:t>
+      </w:r>
+      <w:r>
+        <w:rPr>
+          <w:b/>
+          <w:bCs/>
+        </w:rPr>
+        <w:t xml:space="preserve">CAP_BPF</w:t>
+      </w:r>
+      <w:r>
+        <w:t xml:space="preserve">. Sans privilege, le load eBPF echoue fail-safe (EPERM) -- la preuve qu'il n'y a pas de capture fabriquee (R13/R14). Deux brokers interchangeables : </w:t>
+      </w:r>
+      <w:r>
+        <w:rPr>
+          <w:b/>
+          <w:bCs/>
+        </w:rPr>
+        <w:t xml:space="preserve">replay</w:t>
+      </w:r>
+      <w:r>
+        <w:t xml:space="preserve"> (Python, deterministe, defaut, sans privilege) et </w:t>
+      </w:r>
+      <w:r>
+        <w:rPr>
+          <w:b/>
+          <w:bCs/>
+        </w:rPr>
+        <w:t xml:space="preserve">live</w:t>
+      </w:r>
+      <w:r>
+        <w:t xml:space="preserve"> (le Rust `discoveryprobe-broker`). Mapping pur (I4) : meme capture -&gt; serialisation byte-stable. Double usage : (1) </w:t>
+      </w:r>
+      <w:r>
+        <w:rPr>
+          <w:b/>
+          <w:bCs/>
+        </w:rPr>
+        <w:t xml:space="preserve">sonde de reference</w:t>
+      </w:r>
+      <w:r>
+        <w:t xml:space="preserve"> prouvant que voir l'agent marche sur l'hote ; (2) </w:t>
+      </w:r>
+      <w:r>
+        <w:rPr>
+          <w:b/>
+          <w:bCs/>
+        </w:rPr>
+        <w:t xml:space="preserve">point de conformite</w:t>
+      </w:r>
+      <w:r>
+        <w:t xml:space="preserve"> ou l'outil discovery REEL de l'equipe se branche au meme contrat et est compare a la sonde-reference, meme scorecard, depuis la console (`/discovery-exchange`, vue Probe).</w:t>
       </w:r>
     </w:p>
     <w:p>
@@ -1732,7 +2954,7 @@
         <w:pStyle w:val="Heading1"/>
       </w:pPr>
       <w:r>
-        <w:t xml:space="preserve">4. Architecture</w:t>
+        <w:t xml:space="preserve">7. Identification : juger l'agent sur 4 dimensions</w:t>
       </w:r>
     </w:p>
     <w:p>
@@ -1740,7 +2962,7 @@
         <w:spacing w:after="120"/>
       </w:pPr>
       <w:r>
-        <w:t xml:space="preserve">La plateforme de recette face aux outils externes sous test (discovery + identification) :</w:t>
+        <w:t xml:space="preserve">Une fois l'agent capte, l'identification compare DEUX points de captation (declare vs observe) sur quatre dimensions orthogonales :</w:t>
       </w:r>
     </w:p>
     <w:p>
@@ -1751,9 +2973,9 @@
       <w:r>
         <w:drawing>
           <wp:inline distT="0" distB="0" distL="0" distR="0">
-            <wp:extent cx="5905500" cy="2981325"/>
+            <wp:extent cx="5905500" cy="2200275"/>
             <wp:effectExtent t="0" r="0" b="0" l="0"/>
-            <wp:docPr id="1" name="01_recette_vs_sut" descr="Figure 5 -- Le repo fournit le corpus + le harnais ; les outils discovery/identification sont testes contre la verite-terrain" title="Figure 5 -- Le repo fournit le corpus + le harnais ; les outils discovery/identification sont testes contre la verite-terrain"/>
+            <wp:docPr id="1" name="06_four_dimensions" descr="Figure 5 -- Les 4 dimensions : identite (I3), capabilities, policy (I6), comportement" title="Figure 5 -- Les 4 dimensions : identite (I3), capabilities, policy (I6), comportement"/>
             <wp:cNvGraphicFramePr>
               <a:graphicFrameLocks xmlns:a="http://schemas.openxmlformats.org/drawingml/2006/main" noChangeAspect="1"/>
             </wp:cNvGraphicFramePr>
@@ -1776,7 +2998,7 @@
                   <pic:spPr bwMode="auto">
                     <a:xfrm>
                       <a:off x="0" y="0"/>
-                      <a:ext cx="5905500" cy="2981325"/>
+                      <a:ext cx="5905500" cy="2200275"/>
                     </a:xfrm>
                     <a:prstGeom prst="rect">
                       <a:avLst/>
@@ -1802,7 +3024,87 @@
           <w:sz w:val="18"/>
           <w:szCs w:val="18"/>
         </w:rPr>
-        <w:t xml:space="preserve">Figure 5 -- Le repo fournit le corpus + le harnais ; les outils discovery/identification sont testes contre la verite-terrain</w:t>
+        <w:t xml:space="preserve">Figure 5 -- Les 4 dimensions : identite (I3), capabilities, policy (I6), comportement</w:t>
+      </w:r>
+    </w:p>
+    <w:p>
+      <w:pPr>
+        <w:pStyle w:val="ListParagraph"/>
+        <w:numPr>
+          <w:ilvl w:val="0"/>
+          <w:numId w:val="3"/>
+        </w:numPr>
+        <w:spacing w:after="60"/>
+      </w:pPr>
+      <w:r>
+        <w:rPr>
+          <w:b/>
+          <w:bCs/>
+        </w:rPr>
+        <w:t xml:space="preserve">Identite (I3)</w:t>
+      </w:r>
+      <w:r>
+        <w:t xml:space="preserve"> : le `principal` reellement utilise == le `principal` declare.</w:t>
+      </w:r>
+    </w:p>
+    <w:p>
+      <w:pPr>
+        <w:pStyle w:val="ListParagraph"/>
+        <w:numPr>
+          <w:ilvl w:val="0"/>
+          <w:numId w:val="3"/>
+        </w:numPr>
+        <w:spacing w:after="60"/>
+      </w:pPr>
+      <w:r>
+        <w:rPr>
+          <w:b/>
+          <w:bCs/>
+        </w:rPr>
+        <w:t xml:space="preserve">Capabilities</w:t>
+      </w:r>
+      <w:r>
+        <w:t xml:space="preserve"> : chaque action observee reste dans le `capability_scope` declare.</w:t>
+      </w:r>
+    </w:p>
+    <w:p>
+      <w:pPr>
+        <w:pStyle w:val="ListParagraph"/>
+        <w:numPr>
+          <w:ilvl w:val="0"/>
+          <w:numId w:val="3"/>
+        </w:numPr>
+        <w:spacing w:after="60"/>
+      </w:pPr>
+      <w:r>
+        <w:rPr>
+          <w:b/>
+          <w:bCs/>
+        </w:rPr>
+        <w:t xml:space="preserve">Policy (I6)</w:t>
+      </w:r>
+      <w:r>
+        <w:t xml:space="preserve"> : les actions escalate portent une approbation prealable ; l'escalade bloque jusqu'a resolution.</w:t>
+      </w:r>
+    </w:p>
+    <w:p>
+      <w:pPr>
+        <w:pStyle w:val="ListParagraph"/>
+        <w:numPr>
+          <w:ilvl w:val="0"/>
+          <w:numId w:val="3"/>
+        </w:numPr>
+        <w:spacing w:after="60"/>
+      </w:pPr>
+      <w:r>
+        <w:rPr>
+          <w:b/>
+          <w:bCs/>
+        </w:rPr>
+        <w:t xml:space="preserve">Comportement</w:t>
+      </w:r>
+      <w:r>
+        <w:t xml:space="preserve"> : pas de spam / action hors-role (seuil de repetition).</w:t>
       </w:r>
     </w:p>
     <w:p>
@@ -1810,7 +3112,20 @@
         <w:spacing w:after="120"/>
       </w:pPr>
       <w:r>
-        <w:t xml:space="preserve">Les composants internes : console React, API FastAPI, moteur de recette, lab simule.</w:t>
+        <w:t xml:space="preserve">Verdict `correct` ssi les 4 passent. Determinisme (I4) : meme stream + meme version de policy =&gt; meme verdict, rejouable -- audit forensique possible sur un event store append-only hash-chaine (I1).</w:t>
+      </w:r>
+    </w:p>
+    <w:p>
+      <w:r>
+        <w:br w:type="page"/>
+      </w:r>
+    </w:p>
+    <w:p>
+      <w:pPr>
+        <w:pStyle w:val="Heading1"/>
+      </w:pPr>
+      <w:r>
+        <w:t xml:space="preserve">8. Architecture d'ensemble</w:t>
       </w:r>
     </w:p>
     <w:p>
@@ -1823,7 +3138,7 @@
           <wp:inline distT="0" distB="0" distL="0" distR="0">
             <wp:extent cx="5905500" cy="5324475"/>
             <wp:effectExtent t="0" r="0" b="0" l="0"/>
-            <wp:docPr id="1" name="02_architecture" descr="Figure 6 -- Console / API / moteur / lab : la chaine complete d'execution gouvernee" title="Figure 6 -- Console / API / moteur / lab : la chaine complete d'execution gouvernee"/>
+            <wp:docPr id="1" name="02_architecture" descr="Figure 6 -- Console / API / moteur / lab : la chaine d'execution" title="Figure 6 -- Console / API / moteur / lab : la chaine d'execution"/>
             <wp:cNvGraphicFramePr>
               <a:graphicFrameLocks xmlns:a="http://schemas.openxmlformats.org/drawingml/2006/main" noChangeAspect="1"/>
             </wp:cNvGraphicFramePr>
@@ -1872,7 +3187,77 @@
           <w:sz w:val="18"/>
           <w:szCs w:val="18"/>
         </w:rPr>
-        <w:t xml:space="preserve">Figure 6 -- Console / API / moteur / lab : la chaine complete d'execution gouvernee</w:t>
+        <w:t xml:space="preserve">Figure 6 -- Console / API / moteur / lab : la chaine d'execution</w:t>
+      </w:r>
+    </w:p>
+    <w:p>
+      <w:pPr>
+        <w:spacing w:after="120"/>
+      </w:pPr>
+      <w:r>
+        <w:t xml:space="preserve">Le banc face aux outils externes sous test (discovery + identification) :</w:t>
+      </w:r>
+    </w:p>
+    <w:p>
+      <w:pPr>
+        <w:spacing w:after="60" w:before="160"/>
+        <w:jc w:val="center"/>
+      </w:pPr>
+      <w:r>
+        <w:drawing>
+          <wp:inline distT="0" distB="0" distL="0" distR="0">
+            <wp:extent cx="5905500" cy="2981325"/>
+            <wp:effectExtent t="0" r="0" b="0" l="0"/>
+            <wp:docPr id="1" name="01_recette_vs_sut" descr="Figure 7 -- Le repo fournit le corpus + le harnais ; les outils sont scores contre la verite-terrain" title="Figure 7 -- Le repo fournit le corpus + le harnais ; les outils sont scores contre la verite-terrain"/>
+            <wp:cNvGraphicFramePr>
+              <a:graphicFrameLocks xmlns:a="http://schemas.openxmlformats.org/drawingml/2006/main" noChangeAspect="1"/>
+            </wp:cNvGraphicFramePr>
+            <a:graphic xmlns:a="http://schemas.openxmlformats.org/drawingml/2006/main">
+              <a:graphicData uri="http://schemas.openxmlformats.org/drawingml/2006/picture">
+                <pic:pic xmlns:pic="http://schemas.openxmlformats.org/drawingml/2006/picture">
+                  <pic:nvPicPr>
+                    <pic:cNvPr id="0" name="" descr=""/>
+                    <pic:cNvPicPr>
+                      <a:picLocks noChangeAspect="1" noChangeArrowheads="1"/>
+                    </pic:cNvPicPr>
+                  </pic:nvPicPr>
+                  <pic:blipFill>
+                    <a:blip r:embed="rId15" cstate="none"/>
+                    <a:srcRect/>
+                    <a:stretch>
+                      <a:fillRect/>
+                    </a:stretch>
+                  </pic:blipFill>
+                  <pic:spPr bwMode="auto">
+                    <a:xfrm>
+                      <a:off x="0" y="0"/>
+                      <a:ext cx="5905500" cy="2981325"/>
+                    </a:xfrm>
+                    <a:prstGeom prst="rect">
+                      <a:avLst/>
+                    </a:prstGeom>
+                  </pic:spPr>
+                </pic:pic>
+              </a:graphicData>
+            </a:graphic>
+          </wp:inline>
+        </w:drawing>
+      </w:r>
+    </w:p>
+    <w:p>
+      <w:pPr>
+        <w:spacing w:after="200"/>
+        <w:jc w:val="center"/>
+      </w:pPr>
+      <w:r>
+        <w:rPr>
+          <w:i/>
+          <w:iCs/>
+          <w:color w:val="555555"/>
+          <w:sz w:val="18"/>
+          <w:szCs w:val="18"/>
+        </w:rPr>
+        <w:t xml:space="preserve">Figure 7 -- Le repo fournit le corpus + le harnais ; les outils sont scores contre la verite-terrain</w:t>
       </w:r>
     </w:p>
     <w:p>
@@ -1885,7 +3270,80 @@
         <w:pStyle w:val="Heading1"/>
       </w:pPr>
       <w:r>
-        <w:t xml:space="preserve">5. Les 6 invariants (la loi du systeme)</w:t>
+        <w:t xml:space="preserve">9. Prochaines etapes pour brancher SKYNET</w:t>
+      </w:r>
+    </w:p>
+    <w:p>
+      <w:pPr>
+        <w:pStyle w:val="ListParagraph"/>
+        <w:numPr>
+          <w:ilvl w:val="0"/>
+          <w:numId w:val="2"/>
+        </w:numPr>
+        <w:spacing w:after="60"/>
+      </w:pPr>
+      <w:r>
+        <w:t xml:space="preserve">Declarer le backend SKYNET (`openai_compat` + base_url + cle env) et valider un dry-run depuis le cockpit.</w:t>
+      </w:r>
+    </w:p>
+    <w:p>
+      <w:pPr>
+        <w:pStyle w:val="ListParagraph"/>
+        <w:numPr>
+          <w:ilvl w:val="0"/>
+          <w:numId w:val="2"/>
+        </w:numPr>
+        <w:spacing w:after="60"/>
+      </w:pPr>
+      <w:r>
+        <w:t xml:space="preserve">Mettre quelques agents en `ai_mode = real` / `ai_backend_id = skynet`, cible `server -&gt; mock_local` (trafic observable).</w:t>
+      </w:r>
+    </w:p>
+    <w:p>
+      <w:pPr>
+        <w:pStyle w:val="ListParagraph"/>
+        <w:numPr>
+          <w:ilvl w:val="0"/>
+          <w:numId w:val="2"/>
+        </w:numPr>
+        <w:spacing w:after="60"/>
+      </w:pPr>
+      <w:r>
+        <w:t xml:space="preserve">Activer la captation : ProxyTrace (hook), overlay wire, et la sonde live eBPF (`probe-grant-caps` une fois).</w:t>
+      </w:r>
+    </w:p>
+    <w:p>
+      <w:pPr>
+        <w:pStyle w:val="ListParagraph"/>
+        <w:numPr>
+          <w:ilvl w:val="0"/>
+          <w:numId w:val="2"/>
+        </w:numPr>
+        <w:spacing w:after="60"/>
+      </w:pPr>
+      <w:r>
+        <w:t xml:space="preserve">Lancer la recette discovery + identification sur les agents servis par SKYNET ; lire les scorecards.</w:t>
+      </w:r>
+    </w:p>
+    <w:p>
+      <w:pPr>
+        <w:pStyle w:val="ListParagraph"/>
+        <w:numPr>
+          <w:ilvl w:val="0"/>
+          <w:numId w:val="2"/>
+        </w:numPr>
+        <w:spacing w:after="60"/>
+      </w:pPr>
+      <w:r>
+        <w:t xml:space="preserve">Brancher l'outil discovery REEL de l'equipe sur le meme contrat et comparer a la sonde-reference.</w:t>
+      </w:r>
+    </w:p>
+    <w:p>
+      <w:pPr>
+        <w:pStyle w:val="Heading1"/>
+      </w:pPr>
+      <w:r>
+        <w:t xml:space="preserve">Annexe -- les 6 invariants</w:t>
       </w:r>
     </w:p>
     <w:tbl>
@@ -2012,7 +3470,7 @@
           </w:tcPr>
           <w:p>
             <w:r>
-              <w:t xml:space="preserve">Event store append-only, hash-chaine ; correction = evenement compensatoire</w:t>
+              <w:t xml:space="preserve">event store append-only, hash-chaine ; correction = evenement compensatoire</w:t>
             </w:r>
           </w:p>
         </w:tc>
@@ -2060,7 +3518,7 @@
           </w:tcPr>
           <w:p>
             <w:r>
-              <w:t xml:space="preserve">Aucune action externe sans passage par le Control Plane</w:t>
+              <w:t xml:space="preserve">aucune action externe sans passage par le Control Plane</w:t>
             </w:r>
           </w:p>
         </w:tc>
@@ -2108,7 +3566,7 @@
           </w:tcPr>
           <w:p>
             <w:r>
-              <w:t xml:space="preserve">Toute action liee cryptographiquement a une identite (le passeport)</w:t>
+              <w:t xml:space="preserve">toute action liee a une identite (principal / auth_method)</w:t>
             </w:r>
           </w:p>
         </w:tc>
@@ -2156,7 +3614,7 @@
           </w:tcPr>
           <w:p>
             <w:r>
-              <w:t xml:space="preserve">Meme stream + meme policy =&gt; meme verdict, rejouable</w:t>
+              <w:t xml:space="preserve">meme stream + meme policy =&gt; meme verdict, rejouable</w:t>
             </w:r>
           </w:p>
         </w:tc>
@@ -2204,7 +3662,7 @@
           </w:tcPr>
           <w:p>
             <w:r>
-              <w:t xml:space="preserve">Les effets de bord ne passent que par les proxies</w:t>
+              <w:t xml:space="preserve">les effets de bord ne passent que par les proxies</w:t>
             </w:r>
           </w:p>
         </w:tc>
@@ -2252,85 +3710,12 @@
           </w:tcPr>
           <w:p>
             <w:r>
-              <w:t xml:space="preserve">L'escalade bloque l'execution jusqu'a resolution</w:t>
+              <w:t xml:space="preserve">l'escalade bloque l'execution jusqu'a resolution</w:t>
             </w:r>
           </w:p>
         </w:tc>
       </w:tr>
     </w:tbl>
-    <w:p>
-      <w:pPr>
-        <w:pStyle w:val="Heading1"/>
-      </w:pPr>
-      <w:r>
-        <w:t xml:space="preserve">6. Prochaines etapes pour SKYNET</w:t>
-      </w:r>
-    </w:p>
-    <w:p>
-      <w:pPr>
-        <w:pStyle w:val="ListParagraph"/>
-        <w:numPr>
-          <w:ilvl w:val="0"/>
-          <w:numId w:val="2"/>
-        </w:numPr>
-        <w:spacing w:after="60"/>
-      </w:pPr>
-      <w:r>
-        <w:t xml:space="preserve">Declarer le backend SKYNET (`openai_compat` + base_url + cle env) et valider un run dry-run.</w:t>
-      </w:r>
-    </w:p>
-    <w:p>
-      <w:pPr>
-        <w:pStyle w:val="ListParagraph"/>
-        <w:numPr>
-          <w:ilvl w:val="0"/>
-          <w:numId w:val="2"/>
-        </w:numPr>
-        <w:spacing w:after="60"/>
-      </w:pPr>
-      <w:r>
-        <w:t xml:space="preserve">Definir le capability_scope minimal de SKYNET par systeme cible (moindre privilege).</w:t>
-      </w:r>
-    </w:p>
-    <w:p>
-      <w:pPr>
-        <w:pStyle w:val="ListParagraph"/>
-        <w:numPr>
-          <w:ilvl w:val="0"/>
-          <w:numId w:val="2"/>
-        </w:numPr>
-        <w:spacing w:after="60"/>
-      </w:pPr>
-      <w:r>
-        <w:t xml:space="preserve">Ecrire les policies (allow/deny/escalate) pour les actions sensibles que SKYNET pourrait viser.</w:t>
-      </w:r>
-    </w:p>
-    <w:p>
-      <w:pPr>
-        <w:pStyle w:val="ListParagraph"/>
-        <w:numPr>
-          <w:ilvl w:val="0"/>
-          <w:numId w:val="2"/>
-        </w:numPr>
-        <w:spacing w:after="60"/>
-      </w:pPr>
-      <w:r>
-        <w:t xml:space="preserve">Lancer une campagne red-team ciblant SKYNET (injection, coercition) et mesurer la detection.</w:t>
-      </w:r>
-    </w:p>
-    <w:p>
-      <w:pPr>
-        <w:pStyle w:val="ListParagraph"/>
-        <w:numPr>
-          <w:ilvl w:val="0"/>
-          <w:numId w:val="2"/>
-        </w:numPr>
-        <w:spacing w:after="60"/>
-      </w:pPr>
-      <w:r>
-        <w:t xml:space="preserve">Activer la capture ProxyTrace + l'audit rejouable en continu.</w:t>
-      </w:r>
-    </w:p>
     <w:sectPr>
       <w:headerReference w:type="default" r:id="rId7"/>
       <w:footerReference w:type="default" r:id="rId8"/>

</xml_diff>